<commit_message>
feat(comercial): material da reunião Rocha Auto Peças 17ago
Roteiro, cronômetro, mapa da call, deck da fase 1 e pitch completo;
feedbacks da simulação e da call executada; preparo do JDP e registro
do que saiu na sessão das 11h; pauta da visita de 18ago.
</commit_message>
<xml_diff>
--- a/00 - IRBIS/03 - Comercial/08 - Onboarding (Word)/04 - Reunião de Vendas/Blocos da Reunião - Rocha Auto Peças 17ago.docx
+++ b/00 - IRBIS/03 - Comercial/08 - Onboarding (Word)/04 - Reunião de Vendas/Blocos da Reunião - Rocha Auto Peças 17ago.docx
@@ -2,7 +2,7 @@
 <file path=word/document.xml><?xml version="1.0" encoding="utf-8"?>
 <w:document xmlns:w="http://schemas.openxmlformats.org/wordprocessingml/2006/main" xmlns:m="http://schemas.openxmlformats.org/officeDocument/2006/math" xmlns:r="http://schemas.openxmlformats.org/officeDocument/2006/relationships" xmlns:o="urn:schemas-microsoft-com:office:office" xmlns:v="urn:schemas-microsoft-com:vml" xmlns:w10="urn:schemas-microsoft-com:office:word" xmlns:a="http://schemas.openxmlformats.org/drawingml/2006/main" xmlns:pic="http://schemas.openxmlformats.org/drawingml/2006/picture" xmlns:wp="http://schemas.openxmlformats.org/drawingml/2006/wordprocessingDrawing">
   <w:body>
-    <w:bookmarkStart w:id="49" w:name="X76368739d623c4a8f2c0dc0151ed29d30798dbc"/>
+    <w:bookmarkStart w:id="58" w:name="X76368739d623c4a8f2c0dc0151ed29d30798dbc"/>
     <w:p>
       <w:pPr>
         <w:pStyle w:val="Heading1"/>
@@ -1640,7 +1640,7 @@
       </w:r>
     </w:p>
     <w:bookmarkEnd w:id="30"/>
-    <w:bookmarkStart w:id="32" w:name="bloco-4-17-a-34-min-diagnóstico"/>
+    <w:bookmarkStart w:id="34" w:name="bloco-4-17-a-34-min-diagnóstico"/>
     <w:p>
       <w:pPr>
         <w:pStyle w:val="Heading2"/>
@@ -1947,13 +1947,47 @@
         <w:t xml:space="preserve">quanto custa um atendente pra vocês, tudo somado, com encargos?</w:t>
       </w:r>
     </w:p>
-    <w:bookmarkStart w:id="31" w:name="a-regra-de-saída-deste-bloco"/>
+    <w:bookmarkStart w:id="31" w:name="X695dcc9bcfc154994daecd35f43b6e527065751"/>
     <w:p>
       <w:pPr>
         <w:pStyle w:val="Heading3"/>
       </w:pPr>
       <w:r>
-        <w:t xml:space="preserve">A regra de saída deste bloco</w:t>
+        <w:t xml:space="preserve">As 8 perguntas de descoberta —</w:t>
+      </w:r>
+      <w:r>
+        <w:t xml:space="preserve"> </w:t>
+      </w:r>
+      <w:r>
+        <w:rPr>
+          <w:bCs/>
+          <w:b/>
+        </w:rPr>
+        <w:t xml:space="preserve">suas, não do deck</w:t>
+      </w:r>
+    </w:p>
+    <w:p>
+      <w:pPr>
+        <w:pStyle w:val="BlockText"/>
+      </w:pPr>
+      <w:r>
+        <w:t xml:space="preserve">Decisão do dono, 14/ago:</w:t>
+      </w:r>
+      <w:r>
+        <w:t xml:space="preserve"> </w:t>
+      </w:r>
+      <w:r>
+        <w:rPr>
+          <w:bCs/>
+          <w:b/>
+        </w:rPr>
+        <w:t xml:space="preserve">estas perguntas não entram na apresentação.</w:t>
+      </w:r>
+      <w:r>
+        <w:t xml:space="preserve"> </w:t>
+      </w:r>
+      <w:r>
+        <w:t xml:space="preserve">Elas são o seu roteiro falado, feitas com a tela fechada. O deck só mostra o que já é fato fixo.</w:t>
       </w:r>
     </w:p>
     <w:p>
@@ -1961,76 +1995,502 @@
         <w:pStyle w:val="FirstParagraph"/>
       </w:pPr>
       <w:r>
-        <w:rPr>
-          <w:bCs/>
-          <w:b/>
-        </w:rPr>
-        <w:t xml:space="preserve">Você não sai daqui sem que ELE tenha dito o número.</w:t>
-      </w:r>
-    </w:p>
-    <w:p>
-      <w:pPr>
-        <w:pStyle w:val="BodyText"/>
-      </w:pPr>
-      <w:r>
-        <w:t xml:space="preserve">A pergunta 7 é a mais importante que você vai fazer o dia todo, e a técnica importa:</w:t>
-      </w:r>
-      <w:r>
-        <w:t xml:space="preserve"> </w:t>
-      </w:r>
-      <w:r>
-        <w:rPr>
-          <w:bCs/>
-          <w:b/>
-        </w:rPr>
-        <w:t xml:space="preserve">não estime o custo da folha pra ele.</w:t>
-      </w:r>
-      <w:r>
-        <w:t xml:space="preserve"> </w:t>
-      </w:r>
-      <w:r>
-        <w:t xml:space="preserve">Pergunte, espere, e deixe ele multiplicar por 20 em voz alta.</w:t>
-      </w:r>
-    </w:p>
-    <w:p>
-      <w:pPr>
-        <w:pStyle w:val="BodyText"/>
-      </w:pPr>
-      <w:r>
-        <w:t xml:space="preserve">Se ele disser</w:t>
-      </w:r>
-      <w:r>
-        <w:t xml:space="preserve"> </w:t>
-      </w:r>
-      <w:r>
-        <w:t xml:space="preserve">“</w:t>
-      </w:r>
-      <w:r>
-        <w:t xml:space="preserve">uns R$ 4 mil com tudo</w:t>
-      </w:r>
-      <w:r>
-        <w:t xml:space="preserve">”</w:t>
-      </w:r>
-      <w:r>
-        <w:t xml:space="preserve">, o silêncio seguinte faz o trabalho: são vinte pessoas que ele não consegue contratar. A conta de R$ 80 mil por mês aparece na cabeça dele, não na sua boca.</w:t>
-      </w:r>
-      <w:r>
-        <w:t xml:space="preserve"> </w:t>
-      </w:r>
-      <w:r>
-        <w:rPr>
-          <w:bCs/>
-          <w:b/>
-        </w:rPr>
-        <w:t xml:space="preserve">Número que o cliente calcula sozinho não se negocia depois.</w:t>
-      </w:r>
-    </w:p>
-    <w:p>
-      <w:pPr>
-        <w:pStyle w:val="BodyText"/>
-      </w:pPr>
-      <w:r>
-        <w:t xml:space="preserve">Se ele não der o número, peça:</w:t>
+        <w:t xml:space="preserve">A ordem importa. Cada uma prepara a seguinte, e a 4 é a que decide a reunião.</w:t>
+      </w:r>
+    </w:p>
+    <w:tbl>
+      <w:tblPr>
+        <w:tblStyle w:val="Table"/>
+        <w:tblW w:type="pct" w:w="5000"/>
+        <w:tblLook w:firstRow="1" w:lastRow="0" w:firstColumn="0" w:lastColumn="0" w:noHBand="0" w:noVBand="0" w:val="0020"/>
+        <w:jc w:val="start"/>
+      </w:tblPr>
+      <w:tblGrid>
+        <w:gridCol w:w="2640"/>
+        <w:gridCol w:w="2640"/>
+        <w:gridCol w:w="2640"/>
+      </w:tblGrid>
+      <w:tr>
+        <w:trPr>
+          <w:tblHeader w:val="true"/>
+        </w:trPr>
+        <w:tc>
+          <w:tcPr/>
+          <w:p>
+            <w:pPr>
+              <w:pStyle w:val="Compact"/>
+              <w:jc w:val="left"/>
+            </w:pPr>
+            <w:r>
+              <w:t xml:space="preserve">#</w:t>
+            </w:r>
+          </w:p>
+        </w:tc>
+        <w:tc>
+          <w:tcPr/>
+          <w:p>
+            <w:pPr>
+              <w:pStyle w:val="Compact"/>
+              <w:jc w:val="left"/>
+            </w:pPr>
+            <w:r>
+              <w:t xml:space="preserve">Pergunta</w:t>
+            </w:r>
+          </w:p>
+        </w:tc>
+        <w:tc>
+          <w:tcPr/>
+          <w:p>
+            <w:pPr>
+              <w:pStyle w:val="Compact"/>
+              <w:jc w:val="left"/>
+            </w:pPr>
+            <w:r>
+              <w:t xml:space="preserve">Onde ela vai</w:t>
+            </w:r>
+          </w:p>
+        </w:tc>
+      </w:tr>
+      <w:tr>
+        <w:tc>
+          <w:tcPr/>
+          <w:p>
+            <w:pPr>
+              <w:pStyle w:val="Compact"/>
+              <w:jc w:val="left"/>
+            </w:pPr>
+            <w:r>
+              <w:t xml:space="preserve">1</w:t>
+            </w:r>
+          </w:p>
+        </w:tc>
+        <w:tc>
+          <w:tcPr/>
+          <w:p>
+            <w:pPr>
+              <w:pStyle w:val="Compact"/>
+              <w:jc w:val="left"/>
+            </w:pPr>
+            <w:r>
+              <w:t xml:space="preserve">Quantas ferramentas vocês já compraram pra melhorar o atendimento?</w:t>
+            </w:r>
+          </w:p>
+        </w:tc>
+        <w:tc>
+          <w:tcPr/>
+          <w:p>
+            <w:pPr>
+              <w:pStyle w:val="Compact"/>
+              <w:jc w:val="left"/>
+            </w:pPr>
+            <w:r>
+              <w:t xml:space="preserve">Deixe ele listar tudo. Quanto maior a lista, mais forte a 2</w:t>
+            </w:r>
+          </w:p>
+        </w:tc>
+      </w:tr>
+      <w:tr>
+        <w:tc>
+          <w:tcPr/>
+          <w:p>
+            <w:pPr>
+              <w:pStyle w:val="Compact"/>
+              <w:jc w:val="left"/>
+            </w:pPr>
+            <w:r>
+              <w:t xml:space="preserve">2</w:t>
+            </w:r>
+          </w:p>
+        </w:tc>
+        <w:tc>
+          <w:tcPr/>
+          <w:p>
+            <w:pPr>
+              <w:pStyle w:val="Compact"/>
+              <w:jc w:val="left"/>
+            </w:pPr>
+            <w:r>
+              <w:t xml:space="preserve">E quantas estão rodando hoje do jeito que você imaginou quando comprou?</w:t>
+            </w:r>
+          </w:p>
+        </w:tc>
+        <w:tc>
+          <w:tcPr/>
+          <w:p>
+            <w:pPr>
+              <w:pStyle w:val="Compact"/>
+              <w:jc w:val="left"/>
+            </w:pPr>
+            <w:r>
+              <w:rPr>
+                <w:bCs/>
+                <w:b/>
+              </w:rPr>
+              <w:t xml:space="preserve">O primeiro soco, e é ele que dá.</w:t>
+            </w:r>
+            <w:r>
+              <w:t xml:space="preserve"> </w:t>
+            </w:r>
+            <w:r>
+              <w:t xml:space="preserve">Não comente. Só siga</w:t>
+            </w:r>
+          </w:p>
+        </w:tc>
+      </w:tr>
+      <w:tr>
+        <w:tc>
+          <w:tcPr/>
+          <w:p>
+            <w:pPr>
+              <w:pStyle w:val="Compact"/>
+              <w:jc w:val="left"/>
+            </w:pPr>
+            <w:r>
+              <w:t xml:space="preserve">3</w:t>
+            </w:r>
+          </w:p>
+        </w:tc>
+        <w:tc>
+          <w:tcPr/>
+          <w:p>
+            <w:pPr>
+              <w:pStyle w:val="Compact"/>
+              <w:jc w:val="left"/>
+            </w:pPr>
+            <w:r>
+              <w:t xml:space="preserve">Faz quanto tempo que as vagas estão abertas?</w:t>
+            </w:r>
+          </w:p>
+        </w:tc>
+        <w:tc>
+          <w:tcPr/>
+          <w:p>
+            <w:pPr>
+              <w:pStyle w:val="Compact"/>
+              <w:jc w:val="left"/>
+            </w:pPr>
+            <w:r>
+              <w:t xml:space="preserve">Anote em meses. Volta no fechamento</w:t>
+            </w:r>
+          </w:p>
+        </w:tc>
+      </w:tr>
+      <w:tr>
+        <w:tc>
+          <w:tcPr/>
+          <w:p>
+            <w:pPr>
+              <w:pStyle w:val="Compact"/>
+              <w:jc w:val="left"/>
+            </w:pPr>
+            <w:r>
+              <w:t xml:space="preserve">4</w:t>
+            </w:r>
+          </w:p>
+        </w:tc>
+        <w:tc>
+          <w:tcPr/>
+          <w:p>
+            <w:pPr>
+              <w:pStyle w:val="Compact"/>
+              <w:jc w:val="left"/>
+            </w:pPr>
+            <w:r>
+              <w:rPr>
+                <w:bCs/>
+                <w:b/>
+              </w:rPr>
+              <w:t xml:space="preserve">Se dinheiro não fosse problema, em quanto tempo você preencheria as vinte?</w:t>
+            </w:r>
+          </w:p>
+        </w:tc>
+        <w:tc>
+          <w:tcPr/>
+          <w:p>
+            <w:pPr>
+              <w:pStyle w:val="Compact"/>
+              <w:jc w:val="left"/>
+            </w:pPr>
+            <w:r>
+              <w:rPr>
+                <w:bCs/>
+                <w:b/>
+              </w:rPr>
+              <w:t xml:space="preserve">A mais importante das oito.</w:t>
+            </w:r>
+            <w:r>
+              <w:t xml:space="preserve"> </w:t>
+            </w:r>
+            <w:r>
+              <w:t xml:space="preserve">Não existe resposta boa: ou</w:t>
+            </w:r>
+            <w:r>
+              <w:t xml:space="preserve"> </w:t>
+            </w:r>
+            <w:r>
+              <w:t xml:space="preserve">“</w:t>
+            </w:r>
+            <w:r>
+              <w:t xml:space="preserve">não sei</w:t>
+            </w:r>
+            <w:r>
+              <w:t xml:space="preserve">”</w:t>
+            </w:r>
+            <w:r>
+              <w:t xml:space="preserve"> </w:t>
+            </w:r>
+            <w:r>
+              <w:t xml:space="preserve">ou</w:t>
+            </w:r>
+            <w:r>
+              <w:t xml:space="preserve"> </w:t>
+            </w:r>
+            <w:r>
+              <w:t xml:space="preserve">“</w:t>
+            </w:r>
+            <w:r>
+              <w:t xml:space="preserve">não conseguiria</w:t>
+            </w:r>
+            <w:r>
+              <w:t xml:space="preserve">”</w:t>
+            </w:r>
+            <w:r>
+              <w:t xml:space="preserve">. Nos dois casos ele concluiu sozinho que verba não resolve. Fique quieto três segundos depois</w:t>
+            </w:r>
+          </w:p>
+        </w:tc>
+      </w:tr>
+      <w:tr>
+        <w:tc>
+          <w:tcPr/>
+          <w:p>
+            <w:pPr>
+              <w:pStyle w:val="Compact"/>
+              <w:jc w:val="left"/>
+            </w:pPr>
+            <w:r>
+              <w:t xml:space="preserve">5</w:t>
+            </w:r>
+          </w:p>
+        </w:tc>
+        <w:tc>
+          <w:tcPr/>
+          <w:p>
+            <w:pPr>
+              <w:pStyle w:val="Compact"/>
+              <w:jc w:val="left"/>
+            </w:pPr>
+            <w:r>
+              <w:t xml:space="preserve">Quanto custa um atendente, tudo somado, com encargos?</w:t>
+            </w:r>
+          </w:p>
+        </w:tc>
+        <w:tc>
+          <w:tcPr/>
+          <w:p>
+            <w:pPr>
+              <w:pStyle w:val="Compact"/>
+              <w:jc w:val="left"/>
+            </w:pPr>
+            <w:r>
+              <w:rPr>
+                <w:bCs/>
+                <w:b/>
+              </w:rPr>
+              <w:t xml:space="preserve">Não estime por ele.</w:t>
+            </w:r>
+            <w:r>
+              <w:t xml:space="preserve"> </w:t>
+            </w:r>
+            <w:r>
+              <w:t xml:space="preserve">Espere o número e diga</w:t>
+            </w:r>
+            <w:r>
+              <w:t xml:space="preserve"> </w:t>
+            </w:r>
+            <w:r>
+              <w:t xml:space="preserve">“</w:t>
+            </w:r>
+            <w:r>
+              <w:t xml:space="preserve">vinte vezes isso, por mês</w:t>
+            </w:r>
+            <w:r>
+              <w:t xml:space="preserve">”</w:t>
+            </w:r>
+            <w:r>
+              <w:t xml:space="preserve">. Deixe ele fazer a conta em voz alta</w:t>
+            </w:r>
+          </w:p>
+        </w:tc>
+      </w:tr>
+      <w:tr>
+        <w:tc>
+          <w:tcPr/>
+          <w:p>
+            <w:pPr>
+              <w:pStyle w:val="Compact"/>
+              <w:jc w:val="left"/>
+            </w:pPr>
+            <w:r>
+              <w:t xml:space="preserve">6</w:t>
+            </w:r>
+          </w:p>
+        </w:tc>
+        <w:tc>
+          <w:tcPr/>
+          <w:p>
+            <w:pPr>
+              <w:pStyle w:val="Compact"/>
+              <w:jc w:val="left"/>
+            </w:pPr>
+            <w:r>
+              <w:t xml:space="preserve">O mecânico manda a lista às 8h e ninguém responde até as 11h. Ele espera?</w:t>
+            </w:r>
+          </w:p>
+        </w:tc>
+        <w:tc>
+          <w:tcPr/>
+          <w:p>
+            <w:pPr>
+              <w:pStyle w:val="Compact"/>
+              <w:jc w:val="left"/>
+            </w:pPr>
+            <w:r>
+              <w:t xml:space="preserve">Ele vai rir. A venda perdida vira fato dito por ele</w:t>
+            </w:r>
+          </w:p>
+        </w:tc>
+      </w:tr>
+      <w:tr>
+        <w:tc>
+          <w:tcPr/>
+          <w:p>
+            <w:pPr>
+              <w:pStyle w:val="Compact"/>
+              <w:jc w:val="left"/>
+            </w:pPr>
+            <w:r>
+              <w:t xml:space="preserve">7</w:t>
+            </w:r>
+          </w:p>
+        </w:tc>
+        <w:tc>
+          <w:tcPr/>
+          <w:p>
+            <w:pPr>
+              <w:pStyle w:val="Compact"/>
+              <w:jc w:val="left"/>
+            </w:pPr>
+            <w:r>
+              <w:t xml:space="preserve">E isso aparece em algum relatório que chega até você?</w:t>
+            </w:r>
+          </w:p>
+        </w:tc>
+        <w:tc>
+          <w:tcPr/>
+          <w:p>
+            <w:pPr>
+              <w:pStyle w:val="Compact"/>
+              <w:jc w:val="left"/>
+            </w:pPr>
+            <w:r>
+              <w:t xml:space="preserve">A resposta é não. Não alivie o desconforto</w:t>
+            </w:r>
+          </w:p>
+        </w:tc>
+      </w:tr>
+      <w:tr>
+        <w:tc>
+          <w:tcPr/>
+          <w:p>
+            <w:pPr>
+              <w:pStyle w:val="Compact"/>
+              <w:jc w:val="left"/>
+            </w:pPr>
+            <w:r>
+              <w:t xml:space="preserve">8</w:t>
+            </w:r>
+          </w:p>
+        </w:tc>
+        <w:tc>
+          <w:tcPr/>
+          <w:p>
+            <w:pPr>
+              <w:pStyle w:val="Compact"/>
+              <w:jc w:val="left"/>
+            </w:pPr>
+            <w:r>
+              <w:t xml:space="preserve">Quantos meses faltam pra unidade nova abrir?</w:t>
+            </w:r>
+          </w:p>
+        </w:tc>
+        <w:tc>
+          <w:tcPr/>
+          <w:p>
+            <w:pPr>
+              <w:pStyle w:val="Compact"/>
+              <w:jc w:val="left"/>
+            </w:pPr>
+            <w:r>
+              <w:t xml:space="preserve">A urgência passa a ser dele. Emenda:</w:t>
+            </w:r>
+            <w:r>
+              <w:t xml:space="preserve"> </w:t>
+            </w:r>
+            <w:r>
+              <w:rPr>
+                <w:iCs/>
+                <w:i/>
+              </w:rPr>
+              <w:t xml:space="preserve">“</w:t>
+            </w:r>
+            <w:r>
+              <w:rPr>
+                <w:iCs/>
+                <w:i/>
+              </w:rPr>
+              <w:t xml:space="preserve">e ela vai abrir com esse mesmo processo?</w:t>
+            </w:r>
+            <w:r>
+              <w:rPr>
+                <w:iCs/>
+                <w:i/>
+              </w:rPr>
+              <w:t xml:space="preserve">”</w:t>
+            </w:r>
+          </w:p>
+        </w:tc>
+      </w:tr>
+    </w:tbl>
+    <w:bookmarkEnd w:id="31"/>
+    <w:bookmarkStart w:id="32" w:name="a-devolutiva-falada-não-é-slide"/>
+    <w:p>
+      <w:pPr>
+        <w:pStyle w:val="Heading3"/>
+      </w:pPr>
+      <w:r>
+        <w:t xml:space="preserve">A devolutiva, falada — não é slide</w:t>
+      </w:r>
+    </w:p>
+    <w:p>
+      <w:pPr>
+        <w:pStyle w:val="FirstParagraph"/>
+      </w:pPr>
+      <w:r>
+        <w:t xml:space="preserve">Depois das oito, você recapitula</w:t>
+      </w:r>
+      <w:r>
+        <w:t xml:space="preserve"> </w:t>
+      </w:r>
+      <w:r>
+        <w:rPr>
+          <w:bCs/>
+          <w:b/>
+        </w:rPr>
+        <w:t xml:space="preserve">em voz alta</w:t>
+      </w:r>
+      <w:r>
+        <w:t xml:space="preserve">, com as palavras dele:</w:t>
       </w:r>
     </w:p>
     <w:p>
@@ -2038,13 +2498,7 @@
         <w:pStyle w:val="BlockText"/>
       </w:pPr>
       <w:r>
-        <w:t xml:space="preserve">Chuta pra mim. Um atendente aí, com salário e encargos, fica em quanto</w:t>
-      </w:r>
-      <w:r>
-        <w:t xml:space="preserve"> </w:t>
-      </w:r>
-      <w:r>
-        <w:t xml:space="preserve">por mês?</w:t>
+        <w:t xml:space="preserve">Deixa eu ver se entendi. Vocês compraram [X] ferramentas e nem todas rodam como você imaginou. As vagas estão abertas há [Y] meses, e mesmo com dinheiro você não sabe em quanto tempo preencheria. Cada atendente custa [R$ Z], então as vinte seriam [R$ Z×20] por mês. O cliente que não é respondido compra na esquina, e isso não aparece em relatório nenhum. E a unidade nova abre em [W] meses.</w:t>
       </w:r>
     </w:p>
     <w:p>
@@ -2052,7 +2506,43 @@
         <w:pStyle w:val="FirstParagraph"/>
       </w:pPr>
       <w:r>
-        <w:t xml:space="preserve">Sem esse número, a ancoragem do bloco 6 vira opinião, e opinião negocia.</w:t>
+        <w:t xml:space="preserve">E então a pergunta que fecha o ciclo:</w:t>
+      </w:r>
+    </w:p>
+    <w:p>
+      <w:pPr>
+        <w:pStyle w:val="BlockText"/>
+      </w:pPr>
+      <w:r>
+        <w:rPr>
+          <w:bCs/>
+          <w:b/>
+        </w:rPr>
+        <w:t xml:space="preserve">Isso parece problema de falta de sistema pra você?</w:t>
+      </w:r>
+    </w:p>
+    <w:p>
+      <w:pPr>
+        <w:pStyle w:val="FirstParagraph"/>
+      </w:pPr>
+      <w:r>
+        <w:t xml:space="preserve">Ele vai dizer não.</w:t>
+      </w:r>
+      <w:r>
+        <w:t xml:space="preserve"> </w:t>
+      </w:r>
+      <w:r>
+        <w:rPr>
+          <w:bCs/>
+          <w:b/>
+        </w:rPr>
+        <w:t xml:space="preserve">A frase mais importante da reunião sai da boca dele, não da sua.</w:t>
+      </w:r>
+      <w:r>
+        <w:t xml:space="preserve"> </w:t>
+      </w:r>
+      <w:r>
+        <w:t xml:space="preserve">Só depois do não você abre o deck de novo.</w:t>
       </w:r>
     </w:p>
     <w:p>
@@ -2062,9 +2552,125 @@
         </w:pict>
       </w:r>
     </w:p>
-    <w:bookmarkEnd w:id="31"/>
     <w:bookmarkEnd w:id="32"/>
-    <w:bookmarkStart w:id="38" w:name="X91316a05f3c2fdcb45d476c0cbd11f0570e964c"/>
+    <w:bookmarkStart w:id="33" w:name="a-regra-de-saída-deste-bloco"/>
+    <w:p>
+      <w:pPr>
+        <w:pStyle w:val="Heading3"/>
+      </w:pPr>
+      <w:r>
+        <w:t xml:space="preserve">A regra de saída deste bloco</w:t>
+      </w:r>
+    </w:p>
+    <w:p>
+      <w:pPr>
+        <w:pStyle w:val="FirstParagraph"/>
+      </w:pPr>
+      <w:r>
+        <w:rPr>
+          <w:bCs/>
+          <w:b/>
+        </w:rPr>
+        <w:t xml:space="preserve">Você não sai daqui sem que ELE tenha dito o número.</w:t>
+      </w:r>
+    </w:p>
+    <w:p>
+      <w:pPr>
+        <w:pStyle w:val="BodyText"/>
+      </w:pPr>
+      <w:r>
+        <w:t xml:space="preserve">A pergunta 7 é a mais importante que você vai fazer o dia todo, e a técnica importa:</w:t>
+      </w:r>
+      <w:r>
+        <w:t xml:space="preserve"> </w:t>
+      </w:r>
+      <w:r>
+        <w:rPr>
+          <w:bCs/>
+          <w:b/>
+        </w:rPr>
+        <w:t xml:space="preserve">não estime o custo da folha pra ele.</w:t>
+      </w:r>
+      <w:r>
+        <w:t xml:space="preserve"> </w:t>
+      </w:r>
+      <w:r>
+        <w:t xml:space="preserve">Pergunte, espere, e deixe ele multiplicar por 20 em voz alta.</w:t>
+      </w:r>
+    </w:p>
+    <w:p>
+      <w:pPr>
+        <w:pStyle w:val="BodyText"/>
+      </w:pPr>
+      <w:r>
+        <w:t xml:space="preserve">Se ele disser</w:t>
+      </w:r>
+      <w:r>
+        <w:t xml:space="preserve"> </w:t>
+      </w:r>
+      <w:r>
+        <w:t xml:space="preserve">“</w:t>
+      </w:r>
+      <w:r>
+        <w:t xml:space="preserve">uns R$ 4 mil com tudo</w:t>
+      </w:r>
+      <w:r>
+        <w:t xml:space="preserve">”</w:t>
+      </w:r>
+      <w:r>
+        <w:t xml:space="preserve">, o silêncio seguinte faz o trabalho: são vinte pessoas que ele não consegue contratar. A conta de R$ 80 mil por mês aparece na cabeça dele, não na sua boca.</w:t>
+      </w:r>
+      <w:r>
+        <w:t xml:space="preserve"> </w:t>
+      </w:r>
+      <w:r>
+        <w:rPr>
+          <w:bCs/>
+          <w:b/>
+        </w:rPr>
+        <w:t xml:space="preserve">Número que o cliente calcula sozinho não se negocia depois.</w:t>
+      </w:r>
+    </w:p>
+    <w:p>
+      <w:pPr>
+        <w:pStyle w:val="BodyText"/>
+      </w:pPr>
+      <w:r>
+        <w:t xml:space="preserve">Se ele não der o número, peça:</w:t>
+      </w:r>
+    </w:p>
+    <w:p>
+      <w:pPr>
+        <w:pStyle w:val="BlockText"/>
+      </w:pPr>
+      <w:r>
+        <w:t xml:space="preserve">Chuta pra mim. Um atendente aí, com salário e encargos, fica em quanto</w:t>
+      </w:r>
+      <w:r>
+        <w:t xml:space="preserve"> </w:t>
+      </w:r>
+      <w:r>
+        <w:t xml:space="preserve">por mês?</w:t>
+      </w:r>
+    </w:p>
+    <w:p>
+      <w:pPr>
+        <w:pStyle w:val="FirstParagraph"/>
+      </w:pPr>
+      <w:r>
+        <w:t xml:space="preserve">Sem esse número, a ancoragem do bloco 6 vira opinião, e opinião negocia.</w:t>
+      </w:r>
+    </w:p>
+    <w:p>
+      <w:r>
+        <w:pict>
+          <v:rect style="width:0;height:1.5pt" o:hralign="center" o:hrstd="t" o:hr="t"/>
+        </w:pict>
+      </w:r>
+    </w:p>
+    <w:bookmarkEnd w:id="33"/>
+    <w:bookmarkEnd w:id="34"/>
+    <w:bookmarkStart w:id="40" w:name="X91316a05f3c2fdcb45d476c0cbd11f0570e964c"/>
     <w:p>
       <w:pPr>
         <w:pStyle w:val="Heading2"/>
@@ -2094,7 +2700,7 @@
         <w:t xml:space="preserve">.</w:t>
       </w:r>
     </w:p>
-    <w:bookmarkStart w:id="33" w:name="formato-de-cada-ponto"/>
+    <w:bookmarkStart w:id="35" w:name="formato-de-cada-ponto"/>
     <w:p>
       <w:pPr>
         <w:pStyle w:val="Heading3"/>
@@ -2165,8 +2771,8 @@
         <w:t xml:space="preserve">) saiu. Ele foi construído pra um cliente que a gente não conhecia. Agora a gente conhece, e o argumento certo é outro.</w:t>
       </w:r>
     </w:p>
-    <w:bookmarkEnd w:id="33"/>
-    <w:bookmarkStart w:id="34" w:name="o-reenquadramento-que-decide-a-reunião"/>
+    <w:bookmarkEnd w:id="35"/>
+    <w:bookmarkStart w:id="36" w:name="o-reenquadramento-que-decide-a-reunião"/>
     <w:p>
       <w:pPr>
         <w:pStyle w:val="Heading3"/>
@@ -2296,17 +2902,17 @@
         <w:pStyle w:val="FirstParagraph"/>
       </w:pPr>
       <w:r>
-        <w:t xml:space="preserve">Ele já comprou sistema. Ele já comprou a integração.</w:t>
-      </w:r>
-      <w:r>
-        <w:t xml:space="preserve"> </w:t>
-      </w:r>
-      <w:r>
-        <w:rPr>
-          <w:bCs/>
-          <w:b/>
-        </w:rPr>
-        <w:t xml:space="preserve">As duas coisas estão paradas pelo mesmo motivo pelo qual ele não consegue atender: não existe gente disponível.</w:t>
+        <w:t xml:space="preserve">Ele tem ERP instalado e um projeto de integração de WhatsApp em andamento.</w:t>
+      </w:r>
+      <w:r>
+        <w:t xml:space="preserve"> </w:t>
+      </w:r>
+      <w:r>
+        <w:rPr>
+          <w:bCs/>
+          <w:b/>
+        </w:rPr>
+        <w:t xml:space="preserve">Os dois estão parados pelo mesmo motivo pelo qual ele não consegue atender: não existe gente disponível.</w:t>
       </w:r>
       <w:r>
         <w:t xml:space="preserve"> </w:t>
@@ -2317,65 +2923,319 @@
     </w:p>
     <w:p>
       <w:pPr>
+        <w:pStyle w:val="BlockText"/>
+      </w:pPr>
+      <w:r>
+        <w:t xml:space="preserve">⚠️</w:t>
+      </w:r>
+      <w:r>
+        <w:t xml:space="preserve"> </w:t>
+      </w:r>
+      <w:r>
+        <w:rPr>
+          <w:bCs/>
+          <w:b/>
+        </w:rPr>
+        <w:t xml:space="preserve">Limite do que a gente sabe.</w:t>
+      </w:r>
+      <w:r>
+        <w:t xml:space="preserve"> </w:t>
+      </w:r>
+      <w:r>
+        <w:t xml:space="preserve">O Gabriel apurou</w:t>
+      </w:r>
+      <w:r>
+        <w:t xml:space="preserve"> </w:t>
+      </w:r>
+      <w:r>
+        <w:t xml:space="preserve">“</w:t>
+      </w:r>
+      <w:r>
+        <w:t xml:space="preserve">um programa da TOTVS</w:t>
+      </w:r>
+      <w:r>
+        <w:t xml:space="preserve">”</w:t>
+      </w:r>
+      <w:r>
+        <w:t xml:space="preserve"> </w:t>
+      </w:r>
+      <w:r>
+        <w:t xml:space="preserve">travado por falta de equipe.</w:t>
+      </w:r>
+      <w:r>
+        <w:t xml:space="preserve"> </w:t>
+      </w:r>
+      <w:r>
+        <w:rPr>
+          <w:bCs/>
+          <w:b/>
+        </w:rPr>
+        <w:t xml:space="preserve">Não sabemos se foi comprado, licenciado ou se é uma iniciativa oferecida à base de clientes.</w:t>
+      </w:r>
+      <w:r>
+        <w:t xml:space="preserve"> </w:t>
+      </w:r>
+      <w:r>
+        <w:t xml:space="preserve">Não afirme que ele pagou. Pergunte no bloco 4:</w:t>
+      </w:r>
+      <w:r>
+        <w:t xml:space="preserve"> </w:t>
+      </w:r>
+      <w:r>
+        <w:rPr>
+          <w:iCs/>
+          <w:i/>
+        </w:rPr>
+        <w:t xml:space="preserve">“</w:t>
+      </w:r>
+      <w:r>
+        <w:rPr>
+          <w:iCs/>
+          <w:i/>
+        </w:rPr>
+        <w:t xml:space="preserve">esse programa da TOTVS, vocês contrataram ou é algo que eles oferecem?</w:t>
+      </w:r>
+      <w:r>
+        <w:rPr>
+          <w:iCs/>
+          <w:i/>
+        </w:rPr>
+        <w:t xml:space="preserve">”</w:t>
+      </w:r>
+      <w:r>
+        <w:t xml:space="preserve"> </w:t>
+      </w:r>
+      <w:r>
+        <w:t xml:space="preserve">Se ele confirmar que pagou, o argumento fica mais forte e aí sim você usa.</w:t>
+      </w:r>
+    </w:p>
+    <w:p>
+      <w:pPr>
+        <w:pStyle w:val="FirstParagraph"/>
+      </w:pPr>
+      <w:r>
+        <w:t xml:space="preserve">🔴</w:t>
+      </w:r>
+      <w:r>
+        <w:t xml:space="preserve"> </w:t>
+      </w:r>
+      <w:r>
+        <w:rPr>
+          <w:bCs/>
+          <w:b/>
+        </w:rPr>
+        <w:t xml:space="preserve">Se você entrar falando</w:t>
+      </w:r>
+      <w:r>
+        <w:rPr>
+          <w:bCs/>
+          <w:b/>
+        </w:rPr>
+        <w:t xml:space="preserve"> </w:t>
+      </w:r>
+      <w:r>
+        <w:rPr>
+          <w:bCs/>
+          <w:b/>
+        </w:rPr>
+        <w:t xml:space="preserve">“</w:t>
+      </w:r>
+      <w:r>
+        <w:rPr>
+          <w:bCs/>
+          <w:b/>
+        </w:rPr>
+        <w:t xml:space="preserve">eu automatizo o atendimento</w:t>
+      </w:r>
+      <w:r>
+        <w:rPr>
+          <w:bCs/>
+          <w:b/>
+        </w:rPr>
+        <w:t xml:space="preserve">”</w:t>
+      </w:r>
+      <w:r>
+        <w:rPr>
+          <w:bCs/>
+          <w:b/>
+        </w:rPr>
+        <w:t xml:space="preserve">, você virou o quinto fornecedor de software de uma empresa que já tem software demais e gente de menos.</w:t>
+      </w:r>
+    </w:p>
+    <w:bookmarkEnd w:id="36"/>
+    <w:bookmarkStart w:id="37" w:name="o-mecanismo-em-três-movimentos"/>
+    <w:p>
+      <w:pPr>
+        <w:pStyle w:val="Heading3"/>
+      </w:pPr>
+      <w:r>
+        <w:t xml:space="preserve">O mecanismo, em três movimentos</w:t>
+      </w:r>
+    </w:p>
+    <w:p>
+      <w:pPr>
+        <w:pStyle w:val="FirstParagraph"/>
+      </w:pPr>
+      <w:r>
+        <w:rPr>
+          <w:bCs/>
+          <w:b/>
+        </w:rPr>
+        <w:t xml:space="preserve">Movimento 1 — tira o problema do lugar errado:</w:t>
+      </w:r>
+      <w:r>
+        <w:t xml:space="preserve"> </w:t>
+      </w:r>
+      <w:r>
+        <w:t xml:space="preserve">&gt; Roberto, pelo que você me contou, vocês não têm problema de sistema.</w:t>
+      </w:r>
+      <w:r>
+        <w:t xml:space="preserve"> </w:t>
+      </w:r>
+      <w:r>
+        <w:t xml:space="preserve">&gt; Vocês têm ERP de referência e já contrataram o módulo de WhatsApp.</w:t>
+      </w:r>
+      <w:r>
+        <w:t xml:space="preserve"> </w:t>
+      </w:r>
+      <w:r>
+        <w:t xml:space="preserve">&gt; Ferramenta não falta.</w:t>
+      </w:r>
+    </w:p>
+    <w:p>
+      <w:pPr>
         <w:pStyle w:val="BodyText"/>
       </w:pPr>
       <w:r>
-        <w:t xml:space="preserve">🔴</w:t>
-      </w:r>
-      <w:r>
-        <w:t xml:space="preserve"> </w:t>
-      </w:r>
-      <w:r>
-        <w:rPr>
-          <w:bCs/>
-          <w:b/>
-        </w:rPr>
-        <w:t xml:space="preserve">Se você entrar falando</w:t>
-      </w:r>
-      <w:r>
-        <w:rPr>
-          <w:bCs/>
-          <w:b/>
-        </w:rPr>
-        <w:t xml:space="preserve"> </w:t>
-      </w:r>
-      <w:r>
-        <w:rPr>
-          <w:bCs/>
-          <w:b/>
-        </w:rPr>
-        <w:t xml:space="preserve">“</w:t>
-      </w:r>
-      <w:r>
-        <w:rPr>
-          <w:bCs/>
-          <w:b/>
-        </w:rPr>
-        <w:t xml:space="preserve">eu automatizo o atendimento</w:t>
-      </w:r>
-      <w:r>
-        <w:rPr>
-          <w:bCs/>
-          <w:b/>
-        </w:rPr>
-        <w:t xml:space="preserve">”</w:t>
-      </w:r>
-      <w:r>
-        <w:rPr>
-          <w:bCs/>
-          <w:b/>
-        </w:rPr>
-        <w:t xml:space="preserve">, você virou o quinto fornecedor de software de uma empresa que já tem software demais e gente de menos.</w:t>
-      </w:r>
-    </w:p>
-    <w:bookmarkEnd w:id="34"/>
-    <w:bookmarkStart w:id="35" w:name="o-mecanismo-em-três-movimentos"/>
+        <w:rPr>
+          <w:bCs/>
+          <w:b/>
+        </w:rPr>
+        <w:t xml:space="preserve">Movimento 2 — nomeia o buraco real:</w:t>
+      </w:r>
+      <w:r>
+        <w:t xml:space="preserve"> </w:t>
+      </w:r>
+      <w:r>
+        <w:t xml:space="preserve">&gt; O que falta são vinte pessoas que o mercado não te vende. E esse é um</w:t>
+      </w:r>
+      <w:r>
+        <w:t xml:space="preserve"> </w:t>
+      </w:r>
+      <w:r>
+        <w:t xml:space="preserve">&gt; problema diferente de todos os outros, porque ele não se resolve com</w:t>
+      </w:r>
+      <w:r>
+        <w:t xml:space="preserve"> </w:t>
+      </w:r>
+      <w:r>
+        <w:t xml:space="preserve">&gt; verba. Você pode querer contratar, aprovar a vaga, e mesmo assim não</w:t>
+      </w:r>
+      <w:r>
+        <w:t xml:space="preserve"> </w:t>
+      </w:r>
+      <w:r>
+        <w:t xml:space="preserve">&gt; achar o profissional.</w:t>
+      </w:r>
+      <w:r>
+        <w:t xml:space="preserve"> </w:t>
+      </w:r>
+      <w:r>
+        <w:t xml:space="preserve">&gt;</w:t>
+      </w:r>
+      <w:r>
+        <w:t xml:space="preserve"> </w:t>
+      </w:r>
+      <w:r>
+        <w:t xml:space="preserve">&gt; Enquanto isso, o cliente que manda mensagem no WhatsApp e não é</w:t>
+      </w:r>
+      <w:r>
+        <w:t xml:space="preserve"> </w:t>
+      </w:r>
+      <w:r>
+        <w:t xml:space="preserve">&gt; respondido compra do concorrente. E essa venda nunca aparece em</w:t>
+      </w:r>
+      <w:r>
+        <w:t xml:space="preserve"> </w:t>
+      </w:r>
+      <w:r>
+        <w:t xml:space="preserve">&gt; relatório nenhum, porque ela não chegou a virar pedido.</w:t>
+      </w:r>
+    </w:p>
+    <w:p>
+      <w:pPr>
+        <w:pStyle w:val="BodyText"/>
+      </w:pPr>
+      <w:r>
+        <w:rPr>
+          <w:bCs/>
+          <w:b/>
+        </w:rPr>
+        <w:t xml:space="preserve">Movimento 3 — fecha o laço com a coisa parada:</w:t>
+      </w:r>
+      <w:r>
+        <w:t xml:space="preserve"> </w:t>
+      </w:r>
+      <w:r>
+        <w:t xml:space="preserve">&gt; E repare no detalhe: a ferramenta que vocês compraram pra resolver isso</w:t>
+      </w:r>
+      <w:r>
+        <w:t xml:space="preserve"> </w:t>
+      </w:r>
+      <w:r>
+        <w:t xml:space="preserve">&gt; está parada exatamente pelo mesmo motivo. Falta equipe pra tirar do</w:t>
+      </w:r>
+      <w:r>
+        <w:t xml:space="preserve"> </w:t>
+      </w:r>
+      <w:r>
+        <w:t xml:space="preserve">&gt; papel.</w:t>
+      </w:r>
+      <w:r>
+        <w:t xml:space="preserve"> </w:t>
+      </w:r>
+      <w:r>
+        <w:t xml:space="preserve">&gt;</w:t>
+      </w:r>
+      <w:r>
+        <w:t xml:space="preserve"> </w:t>
+      </w:r>
+      <w:r>
+        <w:t xml:space="preserve">&gt; Então hoje vocês pagam por uma solução que não roda, e perdem</w:t>
+      </w:r>
+      <w:r>
+        <w:t xml:space="preserve"> </w:t>
+      </w:r>
+      <w:r>
+        <w:t xml:space="preserve">&gt; atendimento que ela resolveria.</w:t>
+      </w:r>
+    </w:p>
+    <w:p>
+      <w:pPr>
+        <w:pStyle w:val="BodyText"/>
+      </w:pPr>
+      <w:r>
+        <w:rPr>
+          <w:bCs/>
+          <w:b/>
+        </w:rPr>
+        <w:t xml:space="preserve">Depois do movimento 3, silêncio.</w:t>
+      </w:r>
+      <w:r>
+        <w:t xml:space="preserve"> </w:t>
+      </w:r>
+      <w:r>
+        <w:t xml:space="preserve">Deixe ele reagir. Essa é a frase que ele não ouviu de nenhum dos outros fornecedores.</w:t>
+      </w:r>
+    </w:p>
+    <w:bookmarkEnd w:id="37"/>
+    <w:bookmarkStart w:id="38" w:name="a-armadilha-da-totvs"/>
     <w:p>
       <w:pPr>
         <w:pStyle w:val="Heading3"/>
       </w:pPr>
       <w:r>
-        <w:t xml:space="preserve">O mecanismo, em três movimentos</w:t>
+        <w:t xml:space="preserve">⚠️ A armadilha da TOTVS</w:t>
       </w:r>
     </w:p>
     <w:p>
@@ -2387,25 +3247,13 @@
           <w:bCs/>
           <w:b/>
         </w:rPr>
-        <w:t xml:space="preserve">Movimento 1 — tira o problema do lugar errado:</w:t>
-      </w:r>
-      <w:r>
-        <w:t xml:space="preserve"> </w:t>
-      </w:r>
-      <w:r>
-        <w:t xml:space="preserve">&gt; Roberto, pelo que você me contou, vocês não têm problema de sistema.</w:t>
-      </w:r>
-      <w:r>
-        <w:t xml:space="preserve"> </w:t>
-      </w:r>
-      <w:r>
-        <w:t xml:space="preserve">&gt; Vocês têm ERP de referência e já contrataram o módulo de WhatsApp.</w:t>
-      </w:r>
-      <w:r>
-        <w:t xml:space="preserve"> </w:t>
-      </w:r>
-      <w:r>
-        <w:t xml:space="preserve">&gt; Ferramenta não falta.</w:t>
+        <w:t xml:space="preserve">Não ataque a TOTVS. Ele já escolheu esse caminho.</w:t>
+      </w:r>
+      <w:r>
+        <w:t xml:space="preserve"> </w:t>
+      </w:r>
+      <w:r>
+        <w:t xml:space="preserve">Criticar a escolha é criticar o julgamento dele, e você perde a sala.</w:t>
       </w:r>
     </w:p>
     <w:p>
@@ -2413,135 +3261,54 @@
         <w:pStyle w:val="BodyText"/>
       </w:pPr>
       <w:r>
-        <w:rPr>
-          <w:bCs/>
-          <w:b/>
-        </w:rPr>
-        <w:t xml:space="preserve">Movimento 2 — nomeia o buraco real:</w:t>
-      </w:r>
-      <w:r>
-        <w:t xml:space="preserve"> </w:t>
-      </w:r>
-      <w:r>
-        <w:t xml:space="preserve">&gt; O que falta são vinte pessoas que o mercado não te vende. E esse é um</w:t>
-      </w:r>
-      <w:r>
-        <w:t xml:space="preserve"> </w:t>
-      </w:r>
-      <w:r>
-        <w:t xml:space="preserve">&gt; problema diferente de todos os outros, porque ele não se resolve com</w:t>
-      </w:r>
-      <w:r>
-        <w:t xml:space="preserve"> </w:t>
-      </w:r>
-      <w:r>
-        <w:t xml:space="preserve">&gt; verba. Você pode querer contratar, aprovar a vaga, e mesmo assim não</w:t>
-      </w:r>
-      <w:r>
-        <w:t xml:space="preserve"> </w:t>
-      </w:r>
-      <w:r>
-        <w:t xml:space="preserve">&gt; achar o profissional.</w:t>
-      </w:r>
-      <w:r>
-        <w:t xml:space="preserve"> </w:t>
-      </w:r>
-      <w:r>
-        <w:t xml:space="preserve">&gt;</w:t>
-      </w:r>
-      <w:r>
-        <w:t xml:space="preserve"> </w:t>
-      </w:r>
-      <w:r>
-        <w:t xml:space="preserve">&gt; Enquanto isso, o cliente que manda mensagem no WhatsApp e não é</w:t>
-      </w:r>
-      <w:r>
-        <w:t xml:space="preserve"> </w:t>
-      </w:r>
-      <w:r>
-        <w:t xml:space="preserve">&gt; respondido compra do concorrente. E essa venda nunca aparece em</w:t>
-      </w:r>
-      <w:r>
-        <w:t xml:space="preserve"> </w:t>
-      </w:r>
-      <w:r>
-        <w:t xml:space="preserve">&gt; relatório nenhum, porque ela não chegou a virar pedido.</w:t>
-      </w:r>
-    </w:p>
-    <w:p>
-      <w:pPr>
-        <w:pStyle w:val="BodyText"/>
-      </w:pPr>
-      <w:r>
-        <w:rPr>
-          <w:bCs/>
-          <w:b/>
-        </w:rPr>
-        <w:t xml:space="preserve">Movimento 3 — fecha o laço com a coisa parada:</w:t>
-      </w:r>
-      <w:r>
-        <w:t xml:space="preserve"> </w:t>
-      </w:r>
-      <w:r>
-        <w:t xml:space="preserve">&gt; E repare no detalhe: a ferramenta que vocês compraram pra resolver isso</w:t>
-      </w:r>
-      <w:r>
-        <w:t xml:space="preserve"> </w:t>
-      </w:r>
-      <w:r>
-        <w:t xml:space="preserve">&gt; está parada exatamente pelo mesmo motivo. Falta equipe pra tirar do</w:t>
-      </w:r>
-      <w:r>
-        <w:t xml:space="preserve"> </w:t>
-      </w:r>
-      <w:r>
-        <w:t xml:space="preserve">&gt; papel.</w:t>
-      </w:r>
-      <w:r>
-        <w:t xml:space="preserve"> </w:t>
-      </w:r>
-      <w:r>
-        <w:t xml:space="preserve">&gt;</w:t>
-      </w:r>
-      <w:r>
-        <w:t xml:space="preserve"> </w:t>
-      </w:r>
-      <w:r>
-        <w:t xml:space="preserve">&gt; Então hoje vocês pagam por uma solução que não roda, e perdem</w:t>
-      </w:r>
-      <w:r>
-        <w:t xml:space="preserve"> </w:t>
-      </w:r>
-      <w:r>
-        <w:t xml:space="preserve">&gt; atendimento que ela resolveria.</w:t>
-      </w:r>
-    </w:p>
-    <w:p>
-      <w:pPr>
-        <w:pStyle w:val="BodyText"/>
-      </w:pPr>
-      <w:r>
-        <w:rPr>
-          <w:bCs/>
-          <w:b/>
-        </w:rPr>
-        <w:t xml:space="preserve">Depois do movimento 3, silêncio.</w:t>
-      </w:r>
-      <w:r>
-        <w:t xml:space="preserve"> </w:t>
-      </w:r>
-      <w:r>
-        <w:t xml:space="preserve">Deixe ele reagir. Essa é a frase que ele não ouviu de nenhum dos outros fornecedores.</w:t>
-      </w:r>
-    </w:p>
-    <w:bookmarkEnd w:id="35"/>
-    <w:bookmarkStart w:id="36" w:name="a-armadilha-da-totvs"/>
-    <w:p>
-      <w:pPr>
-        <w:pStyle w:val="Heading3"/>
-      </w:pPr>
-      <w:r>
-        <w:t xml:space="preserve">⚠️ A armadilha da TOTVS</w:t>
+        <w:t xml:space="preserve">A posição honesta, e ela</w:t>
+      </w:r>
+      <w:r>
+        <w:t xml:space="preserve"> </w:t>
+      </w:r>
+      <w:r>
+        <w:rPr>
+          <w:bCs/>
+          <w:b/>
+        </w:rPr>
+        <w:t xml:space="preserve">vende o diagnóstico sozinha</w:t>
+      </w:r>
+      <w:r>
+        <w:t xml:space="preserve">:</w:t>
+      </w:r>
+    </w:p>
+    <w:p>
+      <w:pPr>
+        <w:pStyle w:val="BlockText"/>
+      </w:pPr>
+      <w:r>
+        <w:t xml:space="preserve">Eu não sei ainda se o caminho certo é destravar o que vocês já compraram</w:t>
+      </w:r>
+      <w:r>
+        <w:t xml:space="preserve"> </w:t>
+      </w:r>
+      <w:r>
+        <w:t xml:space="preserve">ou fazer diferente. Quem responde isso é olhar a operação de perto, não</w:t>
+      </w:r>
+      <w:r>
+        <w:t xml:space="preserve"> </w:t>
+      </w:r>
+      <w:r>
+        <w:t xml:space="preserve">eu chutando aqui.</w:t>
+      </w:r>
+    </w:p>
+    <w:p>
+      <w:pPr>
+        <w:pStyle w:val="BlockText"/>
+      </w:pPr>
+      <w:r>
+        <w:t xml:space="preserve">O que eu sei é que essa pergunta está aberta e custa dinheiro todo dia</w:t>
+      </w:r>
+      <w:r>
+        <w:t xml:space="preserve"> </w:t>
+      </w:r>
+      <w:r>
+        <w:t xml:space="preserve">que continua aberta.</w:t>
       </w:r>
     </w:p>
     <w:p>
@@ -2549,79 +3316,6 @@
         <w:pStyle w:val="FirstParagraph"/>
       </w:pPr>
       <w:r>
-        <w:rPr>
-          <w:bCs/>
-          <w:b/>
-        </w:rPr>
-        <w:t xml:space="preserve">Não ataque a TOTVS. Ele já decidiu e já pagou.</w:t>
-      </w:r>
-      <w:r>
-        <w:t xml:space="preserve"> </w:t>
-      </w:r>
-      <w:r>
-        <w:t xml:space="preserve">Criticar aquela escolha é criticar o julgamento dele, e você perde a sala.</w:t>
-      </w:r>
-    </w:p>
-    <w:p>
-      <w:pPr>
-        <w:pStyle w:val="BodyText"/>
-      </w:pPr>
-      <w:r>
-        <w:t xml:space="preserve">A posição honesta, e ela</w:t>
-      </w:r>
-      <w:r>
-        <w:t xml:space="preserve"> </w:t>
-      </w:r>
-      <w:r>
-        <w:rPr>
-          <w:bCs/>
-          <w:b/>
-        </w:rPr>
-        <w:t xml:space="preserve">vende o diagnóstico sozinha</w:t>
-      </w:r>
-      <w:r>
-        <w:t xml:space="preserve">:</w:t>
-      </w:r>
-    </w:p>
-    <w:p>
-      <w:pPr>
-        <w:pStyle w:val="BlockText"/>
-      </w:pPr>
-      <w:r>
-        <w:t xml:space="preserve">Eu não sei ainda se o caminho certo é destravar o que vocês já compraram</w:t>
-      </w:r>
-      <w:r>
-        <w:t xml:space="preserve"> </w:t>
-      </w:r>
-      <w:r>
-        <w:t xml:space="preserve">ou fazer diferente. Quem responde isso é olhar a operação de perto, não</w:t>
-      </w:r>
-      <w:r>
-        <w:t xml:space="preserve"> </w:t>
-      </w:r>
-      <w:r>
-        <w:t xml:space="preserve">eu chutando aqui.</w:t>
-      </w:r>
-    </w:p>
-    <w:p>
-      <w:pPr>
-        <w:pStyle w:val="BlockText"/>
-      </w:pPr>
-      <w:r>
-        <w:t xml:space="preserve">O que eu sei é que essa pergunta está aberta e custa dinheiro todo dia</w:t>
-      </w:r>
-      <w:r>
-        <w:t xml:space="preserve"> </w:t>
-      </w:r>
-      <w:r>
-        <w:t xml:space="preserve">que continua aberta.</w:t>
-      </w:r>
-    </w:p>
-    <w:p>
-      <w:pPr>
-        <w:pStyle w:val="FirstParagraph"/>
-      </w:pPr>
-      <w:r>
         <w:t xml:space="preserve">Existe uma pergunta real, viva, sem resposta, que sangra caixa.</w:t>
       </w:r>
       <w:r>
@@ -2635,8 +3329,8 @@
         <w:t xml:space="preserve">É exatamente isso que uma consultoria compra.</w:t>
       </w:r>
     </w:p>
-    <w:bookmarkEnd w:id="36"/>
-    <w:bookmarkStart w:id="37" w:name="a-ponte-pra-oferta"/>
+    <w:bookmarkEnd w:id="38"/>
+    <w:bookmarkStart w:id="39" w:name="a-ponte-pra-oferta"/>
     <w:p>
       <w:pPr>
         <w:pStyle w:val="Heading3"/>
@@ -2797,9 +3491,9 @@
         </w:pict>
       </w:r>
     </w:p>
-    <w:bookmarkEnd w:id="37"/>
-    <w:bookmarkEnd w:id="38"/>
-    <w:bookmarkStart w:id="42" w:name="bloco-6-46-a-52-min-ancoragem"/>
+    <w:bookmarkEnd w:id="39"/>
+    <w:bookmarkEnd w:id="40"/>
+    <w:bookmarkStart w:id="44" w:name="bloco-6-46-a-52-min-ancoragem"/>
     <w:p>
       <w:pPr>
         <w:pStyle w:val="Heading2"/>
@@ -2860,7 +3554,7 @@
         <w:t xml:space="preserve">Quem fala primeiro depois do número, negocia.</w:t>
       </w:r>
     </w:p>
-    <w:bookmarkStart w:id="39" w:name="Xd089547341cd76fd4db883d786ffa9f1e3ec6d3"/>
+    <w:bookmarkStart w:id="41" w:name="Xd089547341cd76fd4db883d786ffa9f1e3ec6d3"/>
     <w:p>
       <w:pPr>
         <w:pStyle w:val="Heading3"/>
@@ -2919,8 +3613,7 @@
             </w:pPr>
             <w:r>
               <w:rPr>
-                <w:bCs/>
-                <w:b/>
+                <w:strike/>
               </w:rPr>
               <w:t xml:space="preserve">[VALOR FECHADO]</w:t>
             </w:r>
@@ -2934,43 +3627,62 @@
               <w:jc w:val="left"/>
             </w:pPr>
             <w:r>
-              <w:t xml:space="preserve">Reunião com o JDP, segunda 11h. Direção: R$ 20-25 mil</w:t>
-            </w:r>
-          </w:p>
-        </w:tc>
-      </w:tr>
-      <w:tr>
-        <w:tc>
-          <w:tcPr/>
-          <w:p>
-            <w:pPr>
-              <w:pStyle w:val="Compact"/>
-              <w:jc w:val="left"/>
-            </w:pPr>
+              <w:t xml:space="preserve">✅</w:t>
+            </w:r>
+            <w:r>
+              <w:t xml:space="preserve"> </w:t>
+            </w:r>
             <w:r>
               <w:rPr>
                 <w:bCs/>
                 <w:b/>
               </w:rPr>
+              <w:t xml:space="preserve">R$ 30.000</w:t>
+            </w:r>
+            <w:r>
+              <w:t xml:space="preserve">, definido em 14/ago</w:t>
+            </w:r>
+          </w:p>
+        </w:tc>
+      </w:tr>
+      <w:tr>
+        <w:tc>
+          <w:tcPr/>
+          <w:p>
+            <w:pPr>
+              <w:pStyle w:val="Compact"/>
+              <w:jc w:val="left"/>
+            </w:pPr>
+            <w:r>
+              <w:rPr>
+                <w:strike/>
+              </w:rPr>
               <w:t xml:space="preserve">[X] semanas</w:t>
             </w:r>
+          </w:p>
+        </w:tc>
+        <w:tc>
+          <w:tcPr/>
+          <w:p>
+            <w:pPr>
+              <w:pStyle w:val="Compact"/>
+              <w:jc w:val="left"/>
+            </w:pPr>
+            <w:r>
+              <w:t xml:space="preserve">✅</w:t>
+            </w:r>
             <w:r>
               <w:t xml:space="preserve"> </w:t>
             </w:r>
             <w:r>
-              <w:t xml:space="preserve">de prazo</w:t>
-            </w:r>
-          </w:p>
-        </w:tc>
-        <w:tc>
-          <w:tcPr/>
-          <w:p>
-            <w:pPr>
-              <w:pStyle w:val="Compact"/>
-              <w:jc w:val="left"/>
-            </w:pPr>
-            <w:r>
-              <w:t xml:space="preserve">Mesma reunião. Mercado trabalha 3 a 6 semanas pra diagnóstico</w:t>
+              <w:rPr>
+                <w:bCs/>
+                <w:b/>
+              </w:rPr>
+              <w:t xml:space="preserve">6 semanas</w:t>
+            </w:r>
+            <w:r>
+              <w:t xml:space="preserve">, com 8 reuniões e mais 90 dias de acompanhamento</w:t>
             </w:r>
           </w:p>
         </w:tc>
@@ -2981,27 +3693,27 @@
         <w:pStyle w:val="BlockText"/>
       </w:pPr>
       <w:r>
-        <w:t xml:space="preserve">🔴</w:t>
-      </w:r>
-      <w:r>
-        <w:t xml:space="preserve"> </w:t>
-      </w:r>
-      <w:r>
-        <w:rPr>
-          <w:bCs/>
-          <w:b/>
-        </w:rPr>
-        <w:t xml:space="preserve">Se um dos dois chegar em branco nas 15h, vira improviso no bloco de ancoragem.</w:t>
-      </w:r>
-      <w:r>
-        <w:t xml:space="preserve"> </w:t>
-      </w:r>
-      <w:r>
-        <w:t xml:space="preserve">Improviso em ancoragem é o que vira desconto na hora.</w:t>
-      </w:r>
-    </w:p>
-    <w:bookmarkEnd w:id="39"/>
-    <w:bookmarkStart w:id="40" w:name="se-ele-perguntar-quanto-custa-construir"/>
+        <w:t xml:space="preserve">✅</w:t>
+      </w:r>
+      <w:r>
+        <w:t xml:space="preserve"> </w:t>
+      </w:r>
+      <w:r>
+        <w:rPr>
+          <w:bCs/>
+          <w:b/>
+        </w:rPr>
+        <w:t xml:space="preserve">Os dois campos estão fechados.</w:t>
+      </w:r>
+      <w:r>
+        <w:t xml:space="preserve"> </w:t>
+      </w:r>
+      <w:r>
+        <w:t xml:space="preserve">O que continua em aberto para as 11h é a emissão da nota fiscal, sem a qual o pagamento pode não sair do financeiro do Rocha.</w:t>
+      </w:r>
+    </w:p>
+    <w:bookmarkEnd w:id="41"/>
+    <w:bookmarkStart w:id="42" w:name="se-ele-perguntar-quanto-custa-construir"/>
     <w:p>
       <w:pPr>
         <w:pStyle w:val="Heading3"/>
@@ -3044,8 +3756,8 @@
         <w:t xml:space="preserve">que vocês já têm ou não. É exatamente isso que o diagnóstico responde.</w:t>
       </w:r>
     </w:p>
-    <w:bookmarkEnd w:id="40"/>
-    <w:bookmarkStart w:id="41" w:name="calibração-dentro-da-faixa"/>
+    <w:bookmarkEnd w:id="42"/>
+    <w:bookmarkStart w:id="43" w:name="calibração-dentro-da-faixa"/>
     <w:p>
       <w:pPr>
         <w:pStyle w:val="Heading3"/>
@@ -3082,9 +3794,9 @@
         </w:pict>
       </w:r>
     </w:p>
-    <w:bookmarkEnd w:id="41"/>
-    <w:bookmarkEnd w:id="42"/>
-    <w:bookmarkStart w:id="46" w:name="X2643716b21c8680f3288863a7e12ab667de248b"/>
+    <w:bookmarkEnd w:id="43"/>
+    <w:bookmarkEnd w:id="44"/>
+    <w:bookmarkStart w:id="48" w:name="X2643716b21c8680f3288863a7e12ab667de248b"/>
     <w:p>
       <w:pPr>
         <w:pStyle w:val="Heading2"/>
@@ -3093,7 +3805,7 @@
         <w:t xml:space="preserve">Bloco 7 · 52 a 60 min · Fechamento e proposta ao vivo</w:t>
       </w:r>
     </w:p>
-    <w:bookmarkStart w:id="43" w:name="pré-fechamento"/>
+    <w:bookmarkStart w:id="45" w:name="pré-fechamento"/>
     <w:p>
       <w:pPr>
         <w:pStyle w:val="Heading3"/>
@@ -3118,14 +3830,24 @@
         <w:t xml:space="preserve">Objeção que aparecer aqui é objeção real, e ainda dá tempo de tratar.</w:t>
       </w:r>
     </w:p>
-    <w:bookmarkEnd w:id="43"/>
-    <w:bookmarkStart w:id="44" w:name="fechamento-direto"/>
+    <w:bookmarkEnd w:id="45"/>
+    <w:bookmarkStart w:id="46" w:name="Xf9c1ddcdc639b658c9404e90739c8cba5106fe3"/>
     <w:p>
       <w:pPr>
         <w:pStyle w:val="Heading3"/>
       </w:pPr>
       <w:r>
-        <w:t xml:space="preserve">Fechamento direto</w:t>
+        <w:t xml:space="preserve">Fechamento direto —</w:t>
+      </w:r>
+      <w:r>
+        <w:t xml:space="preserve"> </w:t>
+      </w:r>
+      <w:r>
+        <w:rPr>
+          <w:bCs/>
+          <w:b/>
+        </w:rPr>
+        <w:t xml:space="preserve">a decisão sai nesta sala</w:t>
       </w:r>
     </w:p>
     <w:p>
@@ -3133,17 +3855,417 @@
         <w:pStyle w:val="BlockText"/>
       </w:pPr>
       <w:r>
-        <w:t xml:space="preserve">O não me libera pra cuidar de outro cliente. O talvez é o que me</w:t>
-      </w:r>
-      <w:r>
-        <w:t xml:space="preserve"> </w:t>
-      </w:r>
-      <w:r>
-        <w:t xml:space="preserve">atrapalha. Amanhã às 14h você me dá a resposta?</w:t>
-      </w:r>
-    </w:p>
-    <w:bookmarkEnd w:id="44"/>
-    <w:bookmarkStart w:id="45" w:name="o-que-sai-da-sala-em-qualquer-cenário"/>
+        <w:t xml:space="preserve">⚠️</w:t>
+      </w:r>
+      <w:r>
+        <w:t xml:space="preserve"> </w:t>
+      </w:r>
+      <w:r>
+        <w:rPr>
+          <w:bCs/>
+          <w:b/>
+        </w:rPr>
+        <w:t xml:space="preserve">Decisão do dono, 14/ago:</w:t>
+      </w:r>
+      <w:r>
+        <w:t xml:space="preserve"> </w:t>
+      </w:r>
+      <w:r>
+        <w:t xml:space="preserve">o padrão de</w:t>
+      </w:r>
+      <w:r>
+        <w:t xml:space="preserve"> </w:t>
+      </w:r>
+      <w:r>
+        <w:t xml:space="preserve">“</w:t>
+      </w:r>
+      <w:r>
+        <w:t xml:space="preserve">sair com data e hora pra resposta</w:t>
+      </w:r>
+      <w:r>
+        <w:t xml:space="preserve">”</w:t>
+      </w:r>
+      <w:r>
+        <w:t xml:space="preserve">, do</w:t>
+      </w:r>
+      <w:r>
+        <w:t xml:space="preserve"> </w:t>
+      </w:r>
+      <w:r>
+        <w:rPr>
+          <w:rStyle w:val="VerbatimChar"/>
+        </w:rPr>
+        <w:t xml:space="preserve">estrutura-reuniao-unica-irbis.md</w:t>
+      </w:r>
+      <w:r>
+        <w:t xml:space="preserve">, deixa de valer como fecho principal. Depois de conduzir a hora inteira e apresentar o número, pedir resposta pra amanhã joga fora o que a reunião construiu.</w:t>
+      </w:r>
+      <w:r>
+        <w:t xml:space="preserve"> </w:t>
+      </w:r>
+      <w:r>
+        <w:rPr>
+          <w:bCs/>
+          <w:b/>
+        </w:rPr>
+        <w:t xml:space="preserve">Data e hora viram plano B</w:t>
+      </w:r>
+      <w:r>
+        <w:t xml:space="preserve">, não plano A.</w:t>
+      </w:r>
+    </w:p>
+    <w:p>
+      <w:pPr>
+        <w:pStyle w:val="BlockText"/>
+      </w:pPr>
+      <w:r>
+        <w:t xml:space="preserve">Não vou te pedir pra pensar. Você já pensou. As vagas estão abertas há</w:t>
+      </w:r>
+      <w:r>
+        <w:t xml:space="preserve"> </w:t>
+      </w:r>
+      <w:r>
+        <w:t xml:space="preserve">[X] meses e a ferramenta comprada continua parada.</w:t>
+      </w:r>
+    </w:p>
+    <w:p>
+      <w:pPr>
+        <w:pStyle w:val="BlockText"/>
+      </w:pPr>
+      <w:r>
+        <w:t xml:space="preserve">O que falta pra você me dizer sim agora?</w:t>
+      </w:r>
+    </w:p>
+    <w:p>
+      <w:pPr>
+        <w:pStyle w:val="FirstParagraph"/>
+      </w:pPr>
+      <w:r>
+        <w:rPr>
+          <w:bCs/>
+          <w:b/>
+        </w:rPr>
+        <w:t xml:space="preserve">Por que essa pergunta e não</w:t>
+      </w:r>
+      <w:r>
+        <w:rPr>
+          <w:bCs/>
+          <w:b/>
+        </w:rPr>
+        <w:t xml:space="preserve"> </w:t>
+      </w:r>
+      <w:r>
+        <w:rPr>
+          <w:bCs/>
+          <w:b/>
+        </w:rPr>
+        <w:t xml:space="preserve">“</w:t>
+      </w:r>
+      <w:r>
+        <w:rPr>
+          <w:bCs/>
+          <w:b/>
+        </w:rPr>
+        <w:t xml:space="preserve">você quer fechar?</w:t>
+      </w:r>
+      <w:r>
+        <w:rPr>
+          <w:bCs/>
+          <w:b/>
+        </w:rPr>
+        <w:t xml:space="preserve">”</w:t>
+      </w:r>
+      <w:r>
+        <w:t xml:space="preserve"> </w:t>
+      </w:r>
+      <w:r>
+        <w:t xml:space="preserve">A segunda aceita um não como resposta completa. Esta pressupõe o sim e pede o obstáculo. Qualquer coisa que ele disser é a objeção real, e aí você trata</w:t>
+      </w:r>
+      <w:r>
+        <w:t xml:space="preserve"> </w:t>
+      </w:r>
+      <w:r>
+        <w:rPr>
+          <w:iCs/>
+          <w:i/>
+        </w:rPr>
+        <w:t xml:space="preserve">aquilo</w:t>
+      </w:r>
+      <w:r>
+        <w:t xml:space="preserve"> </w:t>
+      </w:r>
+      <w:r>
+        <w:t xml:space="preserve">em vez de discutir preço.</w:t>
+      </w:r>
+    </w:p>
+    <w:p>
+      <w:pPr>
+        <w:pStyle w:val="BodyText"/>
+      </w:pPr>
+      <w:r>
+        <w:rPr>
+          <w:bCs/>
+          <w:b/>
+        </w:rPr>
+        <w:t xml:space="preserve">Depois de perguntar, silêncio.</w:t>
+      </w:r>
+      <w:r>
+        <w:t xml:space="preserve"> </w:t>
+      </w:r>
+      <w:r>
+        <w:t xml:space="preserve">Quem falar primeiro perde.</w:t>
+      </w:r>
+    </w:p>
+    <w:tbl>
+      <w:tblPr>
+        <w:tblStyle w:val="Table"/>
+        <w:tblW w:type="pct" w:w="5000"/>
+        <w:tblLook w:firstRow="1" w:lastRow="0" w:firstColumn="0" w:lastColumn="0" w:noHBand="0" w:noVBand="0" w:val="0020"/>
+        <w:jc w:val="start"/>
+      </w:tblPr>
+      <w:tblGrid>
+        <w:gridCol w:w="3960"/>
+        <w:gridCol w:w="3960"/>
+      </w:tblGrid>
+      <w:tr>
+        <w:trPr>
+          <w:tblHeader w:val="true"/>
+        </w:trPr>
+        <w:tc>
+          <w:tcPr/>
+          <w:p>
+            <w:pPr>
+              <w:pStyle w:val="Compact"/>
+              <w:jc w:val="left"/>
+            </w:pPr>
+            <w:r>
+              <w:t xml:space="preserve">Se ele disser</w:t>
+            </w:r>
+          </w:p>
+        </w:tc>
+        <w:tc>
+          <w:tcPr/>
+          <w:p>
+            <w:pPr>
+              <w:pStyle w:val="Compact"/>
+              <w:jc w:val="left"/>
+            </w:pPr>
+            <w:r>
+              <w:t xml:space="preserve">Você responde</w:t>
+            </w:r>
+          </w:p>
+        </w:tc>
+      </w:tr>
+      <w:tr>
+        <w:tc>
+          <w:tcPr/>
+          <w:p>
+            <w:pPr>
+              <w:pStyle w:val="Compact"/>
+              <w:jc w:val="left"/>
+            </w:pPr>
+            <w:r>
+              <w:t xml:space="preserve">“</w:t>
+            </w:r>
+            <w:r>
+              <w:t xml:space="preserve">Preciso pensar</w:t>
+            </w:r>
+            <w:r>
+              <w:t xml:space="preserve">”</w:t>
+            </w:r>
+          </w:p>
+        </w:tc>
+        <w:tc>
+          <w:tcPr/>
+          <w:p>
+            <w:pPr>
+              <w:pStyle w:val="Compact"/>
+              <w:jc w:val="left"/>
+            </w:pPr>
+            <w:r>
+              <w:rPr>
+                <w:iCs/>
+                <w:i/>
+              </w:rPr>
+              <w:t xml:space="preserve">“</w:t>
+            </w:r>
+            <w:r>
+              <w:rPr>
+                <w:iCs/>
+                <w:i/>
+              </w:rPr>
+              <w:t xml:space="preserve">Pensar sobre o quê, especificamente? Se for valor a gente fala de valor. Se for prazo, resolve o prazo. Mas pensar solto é o que faz isso continuar do jeito que está.</w:t>
+            </w:r>
+            <w:r>
+              <w:rPr>
+                <w:iCs/>
+                <w:i/>
+              </w:rPr>
+              <w:t xml:space="preserve">”</w:t>
+            </w:r>
+          </w:p>
+        </w:tc>
+      </w:tr>
+      <w:tr>
+        <w:tc>
+          <w:tcPr/>
+          <w:p>
+            <w:pPr>
+              <w:pStyle w:val="Compact"/>
+              <w:jc w:val="left"/>
+            </w:pPr>
+            <w:r>
+              <w:t xml:space="preserve">“</w:t>
+            </w:r>
+            <w:r>
+              <w:t xml:space="preserve">Preciso ver com alguém</w:t>
+            </w:r>
+            <w:r>
+              <w:t xml:space="preserve">”</w:t>
+            </w:r>
+          </w:p>
+        </w:tc>
+        <w:tc>
+          <w:tcPr/>
+          <w:p>
+            <w:pPr>
+              <w:pStyle w:val="Compact"/>
+              <w:jc w:val="left"/>
+            </w:pPr>
+            <w:r>
+              <w:t xml:space="preserve">Ele já disse que decide sozinho. Devolva:</w:t>
+            </w:r>
+            <w:r>
+              <w:t xml:space="preserve"> </w:t>
+            </w:r>
+            <w:r>
+              <w:rPr>
+                <w:iCs/>
+                <w:i/>
+              </w:rPr>
+              <w:t xml:space="preserve">“</w:t>
+            </w:r>
+            <w:r>
+              <w:rPr>
+                <w:iCs/>
+                <w:i/>
+              </w:rPr>
+              <w:t xml:space="preserve">você me disse que essa decisão é sua.</w:t>
+            </w:r>
+            <w:r>
+              <w:rPr>
+                <w:iCs/>
+                <w:i/>
+              </w:rPr>
+              <w:t xml:space="preserve">”</w:t>
+            </w:r>
+          </w:p>
+        </w:tc>
+      </w:tr>
+      <w:tr>
+        <w:tc>
+          <w:tcPr/>
+          <w:p>
+            <w:pPr>
+              <w:pStyle w:val="Compact"/>
+              <w:jc w:val="left"/>
+            </w:pPr>
+            <w:r>
+              <w:t xml:space="preserve">“</w:t>
+            </w:r>
+            <w:r>
+              <w:t xml:space="preserve">Me manda a proposta que eu vejo</w:t>
+            </w:r>
+            <w:r>
+              <w:t xml:space="preserve">”</w:t>
+            </w:r>
+          </w:p>
+        </w:tc>
+        <w:tc>
+          <w:tcPr/>
+          <w:p>
+            <w:pPr>
+              <w:pStyle w:val="Compact"/>
+              <w:jc w:val="left"/>
+            </w:pPr>
+            <w:r>
+              <w:rPr>
+                <w:iCs/>
+                <w:i/>
+              </w:rPr>
+              <w:t xml:space="preserve">“</w:t>
+            </w:r>
+            <w:r>
+              <w:rPr>
+                <w:iCs/>
+                <w:i/>
+              </w:rPr>
+              <w:t xml:space="preserve">Mando hoje. Mas a proposta vai confirmar o que a gente já falou aqui. Tem alguma coisa nela que ainda não está clara pra você?</w:t>
+            </w:r>
+            <w:r>
+              <w:rPr>
+                <w:iCs/>
+                <w:i/>
+              </w:rPr>
+              <w:t xml:space="preserve">”</w:t>
+            </w:r>
+          </w:p>
+        </w:tc>
+      </w:tr>
+      <w:tr>
+        <w:tc>
+          <w:tcPr/>
+          <w:p>
+            <w:pPr>
+              <w:pStyle w:val="Compact"/>
+              <w:jc w:val="left"/>
+            </w:pPr>
+            <w:r>
+              <w:t xml:space="preserve">Travou de vez</w:t>
+            </w:r>
+          </w:p>
+        </w:tc>
+        <w:tc>
+          <w:tcPr/>
+          <w:p>
+            <w:pPr>
+              <w:pStyle w:val="Compact"/>
+              <w:jc w:val="left"/>
+            </w:pPr>
+            <w:r>
+              <w:rPr>
+                <w:bCs/>
+                <w:b/>
+              </w:rPr>
+              <w:t xml:space="preserve">Aí sim</w:t>
+            </w:r>
+            <w:r>
+              <w:t xml:space="preserve"> </w:t>
+            </w:r>
+            <w:r>
+              <w:t xml:space="preserve">data e hora, nunca</w:t>
+            </w:r>
+            <w:r>
+              <w:t xml:space="preserve"> </w:t>
+            </w:r>
+            <w:r>
+              <w:t xml:space="preserve">“</w:t>
+            </w:r>
+            <w:r>
+              <w:t xml:space="preserve">te aviso</w:t>
+            </w:r>
+            <w:r>
+              <w:t xml:space="preserve">”</w:t>
+            </w:r>
+            <w:r>
+              <w:t xml:space="preserve">. É plano B, não abertura</w:t>
+            </w:r>
+          </w:p>
+        </w:tc>
+      </w:tr>
+    </w:tbl>
+    <w:bookmarkEnd w:id="46"/>
+    <w:bookmarkStart w:id="47" w:name="o-que-sai-da-sala-em-qualquer-cenário"/>
     <w:p>
       <w:pPr>
         <w:pStyle w:val="Heading3"/>
@@ -3267,15 +4389,680 @@
         </w:pict>
       </w:r>
     </w:p>
-    <w:bookmarkEnd w:id="45"/>
-    <w:bookmarkEnd w:id="46"/>
-    <w:bookmarkStart w:id="47" w:name="o-que-não-entra-em-nenhuma-hipótese"/>
+    <w:p>
+      <w:r>
+        <w:pict>
+          <v:rect style="width:0;height:1.5pt" o:hralign="center" o:hrstd="t" o:hr="t"/>
+        </w:pict>
+      </w:r>
+    </w:p>
+    <w:bookmarkEnd w:id="47"/>
+    <w:bookmarkEnd w:id="48"/>
+    <w:bookmarkStart w:id="49" w:name="os-seis-entregáveis-com-nome"/>
     <w:p>
       <w:pPr>
         <w:pStyle w:val="Heading2"/>
       </w:pPr>
       <w:r>
-        <w:t xml:space="preserve">O que não entra, em nenhuma hipótese</w:t>
+        <w:t xml:space="preserve">Os seis entregáveis, com nome</w:t>
+      </w:r>
+    </w:p>
+    <w:p>
+      <w:pPr>
+        <w:pStyle w:val="FirstParagraph"/>
+      </w:pPr>
+      <w:r>
+        <w:t xml:space="preserve">Entregável sem nome vira</w:t>
+      </w:r>
+      <w:r>
+        <w:t xml:space="preserve"> </w:t>
+      </w:r>
+      <w:r>
+        <w:t xml:space="preserve">“</w:t>
+      </w:r>
+      <w:r>
+        <w:t xml:space="preserve">ele vai me mandar um relatório</w:t>
+      </w:r>
+      <w:r>
+        <w:t xml:space="preserve">”</w:t>
+      </w:r>
+      <w:r>
+        <w:t xml:space="preserve">. Com nome, vira ativo — e ativo se compara com preço.</w:t>
+      </w:r>
+    </w:p>
+    <w:tbl>
+      <w:tblPr>
+        <w:tblStyle w:val="Table"/>
+        <w:tblW w:type="pct" w:w="5000"/>
+        <w:tblLook w:firstRow="1" w:lastRow="0" w:firstColumn="0" w:lastColumn="0" w:noHBand="0" w:noVBand="0" w:val="0020"/>
+        <w:jc w:val="start"/>
+      </w:tblPr>
+      <w:tblGrid>
+        <w:gridCol w:w="2640"/>
+        <w:gridCol w:w="2640"/>
+        <w:gridCol w:w="2640"/>
+      </w:tblGrid>
+      <w:tr>
+        <w:trPr>
+          <w:tblHeader w:val="true"/>
+        </w:trPr>
+        <w:tc>
+          <w:tcPr/>
+          <w:p>
+            <w:pPr>
+              <w:pStyle w:val="Compact"/>
+              <w:jc w:val="left"/>
+            </w:pPr>
+            <w:r>
+              <w:t xml:space="preserve">#</w:t>
+            </w:r>
+          </w:p>
+        </w:tc>
+        <w:tc>
+          <w:tcPr/>
+          <w:p>
+            <w:pPr>
+              <w:pStyle w:val="Compact"/>
+              <w:jc w:val="left"/>
+            </w:pPr>
+            <w:r>
+              <w:t xml:space="preserve">Nome</w:t>
+            </w:r>
+          </w:p>
+        </w:tc>
+        <w:tc>
+          <w:tcPr/>
+          <w:p>
+            <w:pPr>
+              <w:pStyle w:val="Compact"/>
+              <w:jc w:val="left"/>
+            </w:pPr>
+            <w:r>
+              <w:t xml:space="preserve">O que é</w:t>
+            </w:r>
+          </w:p>
+        </w:tc>
+      </w:tr>
+      <w:tr>
+        <w:tc>
+          <w:tcPr/>
+          <w:p>
+            <w:pPr>
+              <w:pStyle w:val="Compact"/>
+              <w:jc w:val="left"/>
+            </w:pPr>
+            <w:r>
+              <w:t xml:space="preserve">1</w:t>
+            </w:r>
+          </w:p>
+        </w:tc>
+        <w:tc>
+          <w:tcPr/>
+          <w:p>
+            <w:pPr>
+              <w:pStyle w:val="Compact"/>
+              <w:jc w:val="left"/>
+            </w:pPr>
+            <w:r>
+              <w:rPr>
+                <w:bCs/>
+                <w:b/>
+              </w:rPr>
+              <w:t xml:space="preserve">Mapa da Operação</w:t>
+            </w:r>
+          </w:p>
+        </w:tc>
+        <w:tc>
+          <w:tcPr/>
+          <w:p>
+            <w:pPr>
+              <w:pStyle w:val="Compact"/>
+              <w:jc w:val="left"/>
+            </w:pPr>
+            <w:r>
+              <w:t xml:space="preserve">As 8 unidades, processo por processo, com onde tempo e venda escapam</w:t>
+            </w:r>
+          </w:p>
+        </w:tc>
+      </w:tr>
+      <w:tr>
+        <w:tc>
+          <w:tcPr/>
+          <w:p>
+            <w:pPr>
+              <w:pStyle w:val="Compact"/>
+              <w:jc w:val="left"/>
+            </w:pPr>
+            <w:r>
+              <w:t xml:space="preserve">2</w:t>
+            </w:r>
+          </w:p>
+        </w:tc>
+        <w:tc>
+          <w:tcPr/>
+          <w:p>
+            <w:pPr>
+              <w:pStyle w:val="Compact"/>
+              <w:jc w:val="left"/>
+            </w:pPr>
+            <w:r>
+              <w:rPr>
+                <w:bCs/>
+                <w:b/>
+              </w:rPr>
+              <w:t xml:space="preserve">Custo do Trabalho Manual</w:t>
+            </w:r>
+          </w:p>
+        </w:tc>
+        <w:tc>
+          <w:tcPr/>
+          <w:p>
+            <w:pPr>
+              <w:pStyle w:val="Compact"/>
+              <w:jc w:val="left"/>
+            </w:pPr>
+            <w:r>
+              <w:t xml:space="preserve">Quanto cada processo consome por mês, em pessoas e horas</w:t>
+            </w:r>
+          </w:p>
+        </w:tc>
+      </w:tr>
+      <w:tr>
+        <w:tc>
+          <w:tcPr/>
+          <w:p>
+            <w:pPr>
+              <w:pStyle w:val="Compact"/>
+              <w:jc w:val="left"/>
+            </w:pPr>
+            <w:r>
+              <w:t xml:space="preserve">3</w:t>
+            </w:r>
+          </w:p>
+        </w:tc>
+        <w:tc>
+          <w:tcPr/>
+          <w:p>
+            <w:pPr>
+              <w:pStyle w:val="Compact"/>
+              <w:jc w:val="left"/>
+            </w:pPr>
+            <w:r>
+              <w:rPr>
+                <w:bCs/>
+                <w:b/>
+              </w:rPr>
+              <w:t xml:space="preserve">Matriz de Priorização</w:t>
+            </w:r>
+          </w:p>
+        </w:tc>
+        <w:tc>
+          <w:tcPr/>
+          <w:p>
+            <w:pPr>
+              <w:pStyle w:val="Compact"/>
+              <w:jc w:val="left"/>
+            </w:pPr>
+            <w:r>
+              <w:t xml:space="preserve">Impacto no caixa × esforço até rodar, com os quatro destinos</w:t>
+            </w:r>
+          </w:p>
+        </w:tc>
+      </w:tr>
+      <w:tr>
+        <w:tc>
+          <w:tcPr/>
+          <w:p>
+            <w:pPr>
+              <w:pStyle w:val="Compact"/>
+              <w:jc w:val="left"/>
+            </w:pPr>
+            <w:r>
+              <w:t xml:space="preserve">4</w:t>
+            </w:r>
+          </w:p>
+        </w:tc>
+        <w:tc>
+          <w:tcPr/>
+          <w:p>
+            <w:pPr>
+              <w:pStyle w:val="Compact"/>
+              <w:jc w:val="left"/>
+            </w:pPr>
+            <w:r>
+              <w:rPr>
+                <w:bCs/>
+                <w:b/>
+              </w:rPr>
+              <w:t xml:space="preserve">Fila de Casos de Uso</w:t>
+            </w:r>
+          </w:p>
+        </w:tc>
+        <w:tc>
+          <w:tcPr/>
+          <w:p>
+            <w:pPr>
+              <w:pStyle w:val="Compact"/>
+              <w:jc w:val="left"/>
+            </w:pPr>
+            <w:r>
+              <w:t xml:space="preserve">A ordem de execução, com retorno de cada um e as dependências</w:t>
+            </w:r>
+          </w:p>
+        </w:tc>
+      </w:tr>
+      <w:tr>
+        <w:tc>
+          <w:tcPr/>
+          <w:p>
+            <w:pPr>
+              <w:pStyle w:val="Compact"/>
+              <w:jc w:val="left"/>
+            </w:pPr>
+            <w:r>
+              <w:t xml:space="preserve">5</w:t>
+            </w:r>
+          </w:p>
+        </w:tc>
+        <w:tc>
+          <w:tcPr/>
+          <w:p>
+            <w:pPr>
+              <w:pStyle w:val="Compact"/>
+              <w:jc w:val="left"/>
+            </w:pPr>
+            <w:r>
+              <w:rPr>
+                <w:bCs/>
+                <w:b/>
+              </w:rPr>
+              <w:t xml:space="preserve">Parecer da Integração</w:t>
+            </w:r>
+          </w:p>
+        </w:tc>
+        <w:tc>
+          <w:tcPr/>
+          <w:p>
+            <w:pPr>
+              <w:pStyle w:val="Compact"/>
+              <w:jc w:val="left"/>
+            </w:pPr>
+            <w:r>
+              <w:t xml:space="preserve">Destravar o que está parado ou seguir outro caminho, com o motivo</w:t>
+            </w:r>
+          </w:p>
+        </w:tc>
+      </w:tr>
+      <w:tr>
+        <w:tc>
+          <w:tcPr/>
+          <w:p>
+            <w:pPr>
+              <w:pStyle w:val="Compact"/>
+              <w:jc w:val="left"/>
+            </w:pPr>
+            <w:r>
+              <w:t xml:space="preserve">6</w:t>
+            </w:r>
+          </w:p>
+        </w:tc>
+        <w:tc>
+          <w:tcPr/>
+          <w:p>
+            <w:pPr>
+              <w:pStyle w:val="Compact"/>
+              <w:jc w:val="left"/>
+            </w:pPr>
+            <w:r>
+              <w:rPr>
+                <w:bCs/>
+                <w:b/>
+              </w:rPr>
+              <w:t xml:space="preserve">Apresentação Executiva</w:t>
+            </w:r>
+          </w:p>
+        </w:tc>
+        <w:tc>
+          <w:tcPr/>
+          <w:p>
+            <w:pPr>
+              <w:pStyle w:val="Compact"/>
+              <w:jc w:val="left"/>
+            </w:pPr>
+            <w:r>
+              <w:t xml:space="preserve">Ao vivo, pra ele e pra quem ele quiser na sala</w:t>
+            </w:r>
+          </w:p>
+        </w:tc>
+      </w:tr>
+    </w:tbl>
+    <w:p>
+      <w:pPr>
+        <w:pStyle w:val="BodyText"/>
+      </w:pPr>
+      <w:r>
+        <w:rPr>
+          <w:bCs/>
+          <w:b/>
+        </w:rPr>
+        <w:t xml:space="preserve">Use os números em voz alta.</w:t>
+      </w:r>
+      <w:r>
+        <w:t xml:space="preserve"> </w:t>
+      </w:r>
+      <w:r>
+        <w:t xml:space="preserve">“</w:t>
+      </w:r>
+      <w:r>
+        <w:t xml:space="preserve">O terceiro entregável é a Matriz de Priorização</w:t>
+      </w:r>
+      <w:r>
+        <w:t xml:space="preserve">”</w:t>
+      </w:r>
+      <w:r>
+        <w:t xml:space="preserve"> </w:t>
+      </w:r>
+      <w:r>
+        <w:t xml:space="preserve">soa como produto que existe.</w:t>
+      </w:r>
+      <w:r>
+        <w:t xml:space="preserve"> </w:t>
+      </w:r>
+      <w:r>
+        <w:t xml:space="preserve">“</w:t>
+      </w:r>
+      <w:r>
+        <w:t xml:space="preserve">Eu vou te mostrar como priorizar</w:t>
+      </w:r>
+      <w:r>
+        <w:t xml:space="preserve">”</w:t>
+      </w:r>
+      <w:r>
+        <w:t xml:space="preserve"> </w:t>
+      </w:r>
+      <w:r>
+        <w:t xml:space="preserve">soa como promessa.</w:t>
+      </w:r>
+    </w:p>
+    <w:p>
+      <w:r>
+        <w:pict>
+          <v:rect style="width:0;height:1.5pt" o:hralign="center" o:hrstd="t" o:hr="t"/>
+        </w:pict>
+      </w:r>
+    </w:p>
+    <w:bookmarkEnd w:id="49"/>
+    <w:bookmarkStart w:id="50" w:name="o-nome-do-produto-na-frente-do-cliente"/>
+    <w:p>
+      <w:pPr>
+        <w:pStyle w:val="Heading2"/>
+      </w:pPr>
+      <w:r>
+        <w:t xml:space="preserve">O nome do produto na frente do cliente</w:t>
+      </w:r>
+    </w:p>
+    <w:p>
+      <w:pPr>
+        <w:pStyle w:val="BlockText"/>
+      </w:pPr>
+      <w:r>
+        <w:t xml:space="preserve">Decisão do dono, 17/ago: no pitch, a oferta se chama</w:t>
+      </w:r>
+      <w:r>
+        <w:t xml:space="preserve"> </w:t>
+      </w:r>
+      <w:r>
+        <w:rPr>
+          <w:bCs/>
+          <w:b/>
+        </w:rPr>
+        <w:t xml:space="preserve">“</w:t>
+      </w:r>
+      <w:r>
+        <w:rPr>
+          <w:bCs/>
+          <w:b/>
+        </w:rPr>
+        <w:t xml:space="preserve">Diagnóstico e priorização de casos de uso</w:t>
+      </w:r>
+      <w:r>
+        <w:rPr>
+          <w:bCs/>
+          <w:b/>
+        </w:rPr>
+        <w:t xml:space="preserve">”</w:t>
+      </w:r>
+      <w:r>
+        <w:t xml:space="preserve">, não</w:t>
+      </w:r>
+      <w:r>
+        <w:t xml:space="preserve"> </w:t>
+      </w:r>
+      <w:r>
+        <w:t xml:space="preserve">“</w:t>
+      </w:r>
+      <w:r>
+        <w:t xml:space="preserve">Consultoria de IA</w:t>
+      </w:r>
+      <w:r>
+        <w:t xml:space="preserve">”</w:t>
+      </w:r>
+      <w:r>
+        <w:t xml:space="preserve">.</w:t>
+      </w:r>
+    </w:p>
+    <w:p>
+      <w:pPr>
+        <w:pStyle w:val="FirstParagraph"/>
+      </w:pPr>
+      <w:r>
+        <w:rPr>
+          <w:bCs/>
+          <w:b/>
+        </w:rPr>
+        <w:t xml:space="preserve">Por que isso fortalece o preço:</w:t>
+      </w:r>
+      <w:r>
+        <w:t xml:space="preserve"> </w:t>
+      </w:r>
+      <w:r>
+        <w:t xml:space="preserve">essa é a categoria como o mercado a nomeia, e é exatamente a linha do levantamento de referência —</w:t>
+      </w:r>
+      <w:r>
+        <w:t xml:space="preserve"> </w:t>
+      </w:r>
+      <w:r>
+        <w:rPr>
+          <w:iCs/>
+          <w:i/>
+        </w:rPr>
+        <w:t xml:space="preserve">diagnóstico e priorização de IA, R$ 10 mil a R$ 40 mil, 3 a 6 semanas</w:t>
+      </w:r>
+      <w:r>
+        <w:t xml:space="preserve">. Vendendo com o nome da categoria, os R$ 30 mil deixam de parecer preço inventado e passam a ser preço de mercado para um cliente acima do porte típico.</w:t>
+      </w:r>
+    </w:p>
+    <w:p>
+      <w:pPr>
+        <w:pStyle w:val="BodyText"/>
+      </w:pPr>
+      <w:r>
+        <w:rPr>
+          <w:bCs/>
+          <w:b/>
+        </w:rPr>
+        <w:t xml:space="preserve">“</w:t>
+      </w:r>
+      <w:r>
+        <w:rPr>
+          <w:bCs/>
+          <w:b/>
+        </w:rPr>
+        <w:t xml:space="preserve">Consultoria</w:t>
+      </w:r>
+      <w:r>
+        <w:rPr>
+          <w:bCs/>
+          <w:b/>
+        </w:rPr>
+        <w:t xml:space="preserve">”</w:t>
+      </w:r>
+      <w:r>
+        <w:rPr>
+          <w:bCs/>
+          <w:b/>
+        </w:rPr>
+        <w:t xml:space="preserve"> </w:t>
+      </w:r>
+      <w:r>
+        <w:rPr>
+          <w:bCs/>
+          <w:b/>
+        </w:rPr>
+        <w:t xml:space="preserve">também carrega um problema:</w:t>
+      </w:r>
+      <w:r>
+        <w:t xml:space="preserve"> </w:t>
+      </w:r>
+      <w:r>
+        <w:t xml:space="preserve">para dono de operação, consultoria costuma evocar relatório e slide.</w:t>
+      </w:r>
+      <w:r>
+        <w:t xml:space="preserve"> </w:t>
+      </w:r>
+      <w:r>
+        <w:t xml:space="preserve">“</w:t>
+      </w:r>
+      <w:r>
+        <w:t xml:space="preserve">Diagnóstico e priorização de casos de uso</w:t>
+      </w:r>
+      <w:r>
+        <w:t xml:space="preserve">”</w:t>
+      </w:r>
+      <w:r>
+        <w:t xml:space="preserve"> </w:t>
+      </w:r>
+      <w:r>
+        <w:t xml:space="preserve">diz o que sai da caixa.</w:t>
+      </w:r>
+    </w:p>
+    <w:p>
+      <w:pPr>
+        <w:pStyle w:val="BodyText"/>
+      </w:pPr>
+      <w:r>
+        <w:t xml:space="preserve">⚠️</w:t>
+      </w:r>
+      <w:r>
+        <w:t xml:space="preserve"> </w:t>
+      </w:r>
+      <w:r>
+        <w:rPr>
+          <w:bCs/>
+          <w:b/>
+        </w:rPr>
+        <w:t xml:space="preserve">No catálogo interno o produto continua sendo Consultoria de IA</w:t>
+      </w:r>
+      <w:r>
+        <w:t xml:space="preserve"> </w:t>
+      </w:r>
+      <w:r>
+        <w:t xml:space="preserve">(</w:t>
+      </w:r>
+      <w:r>
+        <w:rPr>
+          <w:rStyle w:val="VerbatimChar"/>
+        </w:rPr>
+        <w:t xml:space="preserve">politica-de-preco-irbis.md</w:t>
+      </w:r>
+      <w:r>
+        <w:t xml:space="preserve">,</w:t>
+      </w:r>
+      <w:r>
+        <w:t xml:space="preserve"> </w:t>
+      </w:r>
+      <w:r>
+        <w:rPr>
+          <w:rStyle w:val="VerbatimChar"/>
+        </w:rPr>
+        <w:t xml:space="preserve">stripe-catalogo-produtos-irbis.md</w:t>
+      </w:r>
+      <w:r>
+        <w:t xml:space="preserve">). O que mudou é o nome comercial na apresentação, não o item do catálogo. Se a IRBIS decidir renomear de vez, os dois documentos precisam ser atualizados juntos.</w:t>
+      </w:r>
+    </w:p>
+    <w:p>
+      <w:r>
+        <w:pict>
+          <v:rect style="width:0;height:1.5pt" o:hralign="center" o:hrstd="t" o:hr="t"/>
+        </w:pict>
+      </w:r>
+    </w:p>
+    <w:bookmarkEnd w:id="50"/>
+    <w:bookmarkStart w:id="55" w:name="o-processo-de-entrega-como-ele-é-vendido"/>
+    <w:p>
+      <w:pPr>
+        <w:pStyle w:val="Heading2"/>
+      </w:pPr>
+      <w:r>
+        <w:t xml:space="preserve">O processo de entrega, como ele é vendido</w:t>
+      </w:r>
+    </w:p>
+    <w:p>
+      <w:pPr>
+        <w:pStyle w:val="BlockText"/>
+      </w:pPr>
+      <w:r>
+        <w:t xml:space="preserve">Definido pelo dono em 14/ago.</w:t>
+      </w:r>
+      <w:r>
+        <w:t xml:space="preserve"> </w:t>
+      </w:r>
+      <w:r>
+        <w:rPr>
+          <w:bCs/>
+          <w:b/>
+        </w:rPr>
+        <w:t xml:space="preserve">Substitui, para Consultoria, as 8 fases do</w:t>
+      </w:r>
+      <w:r>
+        <w:rPr>
+          <w:bCs/>
+          <w:b/>
+        </w:rPr>
+        <w:t xml:space="preserve"> </w:t>
+      </w:r>
+      <w:r>
+        <w:rPr>
+          <w:rStyle w:val="VerbatimChar"/>
+          <w:bCs/>
+          <w:b/>
+        </w:rPr>
+        <w:t xml:space="preserve">metodo-entrega-irbis.md</w:t>
+      </w:r>
+      <w:r>
+        <w:t xml:space="preserve">, que foram escritas para projeto de construção e não servem aqui.</w:t>
+      </w:r>
+    </w:p>
+    <w:p>
+      <w:pPr>
+        <w:pStyle w:val="FirstParagraph"/>
+      </w:pPr>
+      <w:r>
+        <w:rPr>
+          <w:bCs/>
+          <w:b/>
+        </w:rPr>
+        <w:t xml:space="preserve">Seis semanas. No mínimo oito reuniões espaçadas ao longo delas.</w:t>
+      </w:r>
+    </w:p>
+    <w:bookmarkStart w:id="51" w:name="o-formato-de-toda-reunião-a-partir-da-f1"/>
+    <w:p>
+      <w:pPr>
+        <w:pStyle w:val="Heading3"/>
+      </w:pPr>
+      <w:r>
+        <w:t xml:space="preserve">O formato de toda reunião, a partir da F1</w:t>
       </w:r>
     </w:p>
     <w:p>
@@ -3287,7 +5074,7 @@
         <w:pStyle w:val="Compact"/>
       </w:pPr>
       <w:r>
-        <w:t xml:space="preserve">❌ Número fechado de implementação. Você não diagnosticou nada ainda</w:t>
+        <w:t xml:space="preserve">Mostramos o que foi feito desde o último encontro, e o que já foi revelado da operação</w:t>
       </w:r>
     </w:p>
     <w:p>
@@ -3299,7 +5086,7 @@
         <w:pStyle w:val="Compact"/>
       </w:pPr>
       <w:r>
-        <w:t xml:space="preserve">❌ Deck compartilhado na tela. Nunca foi auditado depois do pivot</w:t>
+        <w:t xml:space="preserve">Discutimos a fase atual e como ela será executada</w:t>
       </w:r>
     </w:p>
     <w:p>
@@ -3311,103 +5098,1329 @@
         <w:pStyle w:val="Compact"/>
       </w:pPr>
       <w:r>
-        <w:t xml:space="preserve">❌ Site, landing page, identidade visual. Fora de escopo desde 04/ago</w:t>
-      </w:r>
-    </w:p>
-    <w:p>
-      <w:pPr>
-        <w:numPr>
-          <w:ilvl w:val="0"/>
-          <w:numId w:val="1004"/>
-        </w:numPr>
-        <w:pStyle w:val="Compact"/>
-      </w:pPr>
-      <w:r>
-        <w:t xml:space="preserve">❌ Prazo de construção. Não existe padrão.</w:t>
-      </w:r>
-      <w:r>
-        <w:t xml:space="preserve"> </w:t>
-      </w:r>
-      <w:r>
-        <w:rPr>
-          <w:iCs/>
-          <w:i/>
+        <w:t xml:space="preserve">Vocês ajustam o rumo antes da próxima etapa</w:t>
+      </w:r>
+    </w:p>
+    <w:p>
+      <w:pPr>
+        <w:pStyle w:val="FirstParagraph"/>
+      </w:pPr>
+      <w:r>
+        <w:rPr>
+          <w:bCs/>
+          <w:b/>
+        </w:rPr>
+        <w:t xml:space="preserve">Por que isso importa mais neste cliente que em qualquer outro:</w:t>
+      </w:r>
+      <w:r>
+        <w:t xml:space="preserve"> </w:t>
+      </w:r>
+      <w:r>
+        <w:t xml:space="preserve">o fornecedor que sumiu não sumiu de uma vez, parou de dar notícia. Oito reuniões marcadas é a resposta estrutural a esse medo, e vale dizer isso em voz alta na reunião.</w:t>
+      </w:r>
+    </w:p>
+    <w:bookmarkEnd w:id="51"/>
+    <w:bookmarkStart w:id="52" w:name="as-oito-fases"/>
+    <w:p>
+      <w:pPr>
+        <w:pStyle w:val="Heading3"/>
+      </w:pPr>
+      <w:r>
+        <w:t xml:space="preserve">As oito fases</w:t>
+      </w:r>
+    </w:p>
+    <w:tbl>
+      <w:tblPr>
+        <w:tblStyle w:val="Table"/>
+        <w:tblW w:type="pct" w:w="5000"/>
+        <w:tblLook w:firstRow="1" w:lastRow="0" w:firstColumn="0" w:lastColumn="0" w:noHBand="0" w:noVBand="0" w:val="0020"/>
+        <w:jc w:val="start"/>
+      </w:tblPr>
+      <w:tblGrid>
+        <w:gridCol w:w="1584"/>
+        <w:gridCol w:w="1584"/>
+        <w:gridCol w:w="1584"/>
+        <w:gridCol w:w="1584"/>
+        <w:gridCol w:w="1584"/>
+      </w:tblGrid>
+      <w:tr>
+        <w:trPr>
+          <w:tblHeader w:val="true"/>
+        </w:trPr>
+        <w:tc>
+          <w:tcPr/>
+          <w:p>
+            <w:pPr>
+              <w:pStyle w:val="Compact"/>
+              <w:jc w:val="left"/>
+            </w:pPr>
+            <w:r>
+              <w:t xml:space="preserve">Fase</w:t>
+            </w:r>
+          </w:p>
+        </w:tc>
+        <w:tc>
+          <w:tcPr/>
+          <w:p>
+            <w:pPr>
+              <w:pStyle w:val="Compact"/>
+              <w:jc w:val="left"/>
+            </w:pPr>
+            <w:r>
+              <w:t xml:space="preserve">Quando</w:t>
+            </w:r>
+          </w:p>
+        </w:tc>
+        <w:tc>
+          <w:tcPr/>
+          <w:p>
+            <w:pPr>
+              <w:pStyle w:val="Compact"/>
+              <w:jc w:val="left"/>
+            </w:pPr>
+            <w:r>
+              <w:t xml:space="preserve">O que acontece</w:t>
+            </w:r>
+          </w:p>
+        </w:tc>
+        <w:tc>
+          <w:tcPr/>
+          <w:p>
+            <w:pPr>
+              <w:pStyle w:val="Compact"/>
+              <w:jc w:val="left"/>
+            </w:pPr>
+            <w:r>
+              <w:t xml:space="preserve">Quem participa</w:t>
+            </w:r>
+          </w:p>
+        </w:tc>
+        <w:tc>
+          <w:tcPr/>
+          <w:p>
+            <w:pPr>
+              <w:pStyle w:val="Compact"/>
+              <w:jc w:val="left"/>
+            </w:pPr>
+            <w:r>
+              <w:t xml:space="preserve">O que sai daqui</w:t>
+            </w:r>
+          </w:p>
+        </w:tc>
+      </w:tr>
+      <w:tr>
+        <w:tc>
+          <w:tcPr/>
+          <w:p>
+            <w:pPr>
+              <w:pStyle w:val="Compact"/>
+              <w:jc w:val="left"/>
+            </w:pPr>
+            <w:r>
+              <w:rPr>
+                <w:bCs/>
+                <w:b/>
+              </w:rPr>
+              <w:t xml:space="preserve">F0</w:t>
+            </w:r>
+            <w:r>
+              <w:t xml:space="preserve"> </w:t>
+            </w:r>
+            <w:r>
+              <w:t xml:space="preserve">Fechamento</w:t>
+            </w:r>
+          </w:p>
+        </w:tc>
+        <w:tc>
+          <w:tcPr/>
+          <w:p>
+            <w:pPr>
+              <w:pStyle w:val="Compact"/>
+              <w:jc w:val="left"/>
+            </w:pPr>
+            <w:r>
+              <w:t xml:space="preserve">Hoje, nesta sala</w:t>
+            </w:r>
+          </w:p>
+        </w:tc>
+        <w:tc>
+          <w:tcPr/>
+          <w:p>
+            <w:pPr>
+              <w:pStyle w:val="Compact"/>
+              <w:jc w:val="left"/>
+            </w:pPr>
+            <w:r>
+              <w:t xml:space="preserve">Decisão e pagamento. Sem espera entre o sim e o começo</w:t>
+            </w:r>
+          </w:p>
+        </w:tc>
+        <w:tc>
+          <w:tcPr/>
+          <w:p>
+            <w:pPr>
+              <w:pStyle w:val="Compact"/>
+              <w:jc w:val="left"/>
+            </w:pPr>
+            <w:r>
+              <w:t xml:space="preserve">Você e ele</w:t>
+            </w:r>
+          </w:p>
+        </w:tc>
+        <w:tc>
+          <w:tcPr/>
+          <w:p>
+            <w:pPr>
+              <w:pStyle w:val="Compact"/>
+              <w:jc w:val="left"/>
+            </w:pPr>
+            <w:r>
+              <w:t xml:space="preserve">Data da F1 marcada antes dele sair da sala</w:t>
+            </w:r>
+          </w:p>
+        </w:tc>
+      </w:tr>
+      <w:tr>
+        <w:tc>
+          <w:tcPr/>
+          <w:p>
+            <w:pPr>
+              <w:pStyle w:val="Compact"/>
+              <w:jc w:val="left"/>
+            </w:pPr>
+            <w:r>
+              <w:rPr>
+                <w:bCs/>
+                <w:b/>
+              </w:rPr>
+              <w:t xml:space="preserve">F1</w:t>
+            </w:r>
+            <w:r>
+              <w:t xml:space="preserve"> </w:t>
+            </w:r>
+            <w:r>
+              <w:t xml:space="preserve">Escopo e calendário</w:t>
+            </w:r>
+          </w:p>
+        </w:tc>
+        <w:tc>
+          <w:tcPr/>
+          <w:p>
+            <w:pPr>
+              <w:pStyle w:val="Compact"/>
+              <w:jc w:val="left"/>
+            </w:pPr>
+            <w:r>
+              <w:t xml:space="preserve">Até 5 dias úteis</w:t>
+            </w:r>
+          </w:p>
+        </w:tc>
+        <w:tc>
+          <w:tcPr/>
+          <w:p>
+            <w:pPr>
+              <w:pStyle w:val="Compact"/>
+              <w:jc w:val="left"/>
+            </w:pPr>
+            <w:r>
+              <w:t xml:space="preserve">Define junto o que entra: quais processos, quais unidades, com quem falar.</w:t>
+            </w:r>
+            <w:r>
+              <w:t xml:space="preserve"> </w:t>
+            </w:r>
+            <w:r>
+              <w:rPr>
+                <w:bCs/>
+                <w:b/>
+              </w:rPr>
+              <w:t xml:space="preserve">Frente que não faz sentido mapear sai agora, não no fim</w:t>
+            </w:r>
+          </w:p>
+        </w:tc>
+        <w:tc>
+          <w:tcPr/>
+          <w:p>
+            <w:pPr>
+              <w:pStyle w:val="Compact"/>
+              <w:jc w:val="left"/>
+            </w:pPr>
+            <w:r>
+              <w:t xml:space="preserve">Você, ele e quem ele indicar</w:t>
+            </w:r>
+          </w:p>
+        </w:tc>
+        <w:tc>
+          <w:tcPr/>
+          <w:p>
+            <w:pPr>
+              <w:pStyle w:val="Compact"/>
+              <w:jc w:val="left"/>
+            </w:pPr>
+            <w:r>
+              <w:t xml:space="preserve">Escopo por escrito + calendário das 8 reuniões com data e hora</w:t>
+            </w:r>
+          </w:p>
+        </w:tc>
+      </w:tr>
+      <w:tr>
+        <w:tc>
+          <w:tcPr/>
+          <w:p>
+            <w:pPr>
+              <w:pStyle w:val="Compact"/>
+              <w:jc w:val="left"/>
+            </w:pPr>
+            <w:r>
+              <w:rPr>
+                <w:bCs/>
+                <w:b/>
+              </w:rPr>
+              <w:t xml:space="preserve">F2</w:t>
+            </w:r>
+            <w:r>
+              <w:t xml:space="preserve"> </w:t>
+            </w:r>
+            <w:r>
+              <w:t xml:space="preserve">Plano do diagnóstico</w:t>
+            </w:r>
+          </w:p>
+        </w:tc>
+        <w:tc>
+          <w:tcPr/>
+          <w:p>
+            <w:pPr>
+              <w:pStyle w:val="Compact"/>
+              <w:jc w:val="left"/>
+            </w:pPr>
+            <w:r>
+              <w:t xml:space="preserve">Semana 1</w:t>
+            </w:r>
+          </w:p>
+        </w:tc>
+        <w:tc>
+          <w:tcPr/>
+          <w:p>
+            <w:pPr>
+              <w:pStyle w:val="Compact"/>
+              <w:jc w:val="left"/>
+            </w:pPr>
+            <w:r>
+              <w:t xml:space="preserve">Como o levantamento acontece: que dados eles separam, ordem das visitas, quem te acompanha em cada unidade</w:t>
+            </w:r>
+          </w:p>
+        </w:tc>
+        <w:tc>
+          <w:tcPr/>
+          <w:p>
+            <w:pPr>
+              <w:pStyle w:val="Compact"/>
+              <w:jc w:val="left"/>
+            </w:pPr>
+            <w:r>
+              <w:t xml:space="preserve">Você, ele e os responsáveis das unidades</w:t>
+            </w:r>
+          </w:p>
+        </w:tc>
+        <w:tc>
+          <w:tcPr/>
+          <w:p>
+            <w:pPr>
+              <w:pStyle w:val="Compact"/>
+              <w:jc w:val="left"/>
+            </w:pPr>
+            <w:r>
+              <w:t xml:space="preserve">Plano de campo + lista do que você precisa receber antes</w:t>
+            </w:r>
+          </w:p>
+        </w:tc>
+      </w:tr>
+      <w:tr>
+        <w:tc>
+          <w:tcPr/>
+          <w:p>
+            <w:pPr>
+              <w:pStyle w:val="Compact"/>
+              <w:jc w:val="left"/>
+            </w:pPr>
+            <w:r>
+              <w:rPr>
+                <w:bCs/>
+                <w:b/>
+              </w:rPr>
+              <w:t xml:space="preserve">F3</w:t>
+            </w:r>
+            <w:r>
+              <w:t xml:space="preserve"> </w:t>
+            </w:r>
+            <w:r>
+              <w:t xml:space="preserve">Levantamento em campo</w:t>
+            </w:r>
+          </w:p>
+        </w:tc>
+        <w:tc>
+          <w:tcPr/>
+          <w:p>
+            <w:pPr>
+              <w:pStyle w:val="Compact"/>
+              <w:jc w:val="left"/>
+            </w:pPr>
+            <w:r>
+              <w:t xml:space="preserve">Semanas 1 a 3</w:t>
+            </w:r>
+          </w:p>
+        </w:tc>
+        <w:tc>
+          <w:tcPr/>
+          <w:p>
+            <w:pPr>
+              <w:pStyle w:val="Compact"/>
+              <w:jc w:val="left"/>
+            </w:pPr>
+            <w:r>
+              <w:t xml:space="preserve">Você vai às unidades. Acompanha atendimento ao vivo, conversa com quem opera, cronometra e conta o que ninguém conta</w:t>
+            </w:r>
+          </w:p>
+        </w:tc>
+        <w:tc>
+          <w:tcPr/>
+          <w:p>
+            <w:pPr>
+              <w:pStyle w:val="Compact"/>
+              <w:jc w:val="left"/>
+            </w:pPr>
+            <w:r>
+              <w:t xml:space="preserve">Você em campo, com a equipe de cada unidade</w:t>
+            </w:r>
+          </w:p>
+        </w:tc>
+        <w:tc>
+          <w:tcPr/>
+          <w:p>
+            <w:pPr>
+              <w:pStyle w:val="Compact"/>
+              <w:jc w:val="left"/>
+            </w:pPr>
+            <w:r>
+              <w:t xml:space="preserve">Base do Mapa da Operação e do Custo do Trabalho Manual · 2 a 3 encontros no período</w:t>
+            </w:r>
+          </w:p>
+        </w:tc>
+      </w:tr>
+      <w:tr>
+        <w:tc>
+          <w:tcPr/>
+          <w:p>
+            <w:pPr>
+              <w:pStyle w:val="Compact"/>
+              <w:jc w:val="left"/>
+            </w:pPr>
+            <w:r>
+              <w:rPr>
+                <w:bCs/>
+                <w:b/>
+              </w:rPr>
+              <w:t xml:space="preserve">F4</w:t>
+            </w:r>
+            <w:r>
+              <w:t xml:space="preserve"> </w:t>
+            </w:r>
+            <w:r>
+              <w:t xml:space="preserve">Priorização com eles</w:t>
+            </w:r>
+          </w:p>
+        </w:tc>
+        <w:tc>
+          <w:tcPr/>
+          <w:p>
+            <w:pPr>
+              <w:pStyle w:val="Compact"/>
+              <w:jc w:val="left"/>
+            </w:pPr>
+            <w:r>
+              <w:t xml:space="preserve">Semanas 4 e 5</w:t>
+            </w:r>
+          </w:p>
+        </w:tc>
+        <w:tc>
+          <w:tcPr/>
+          <w:p>
+            <w:pPr>
+              <w:pStyle w:val="Compact"/>
+              <w:jc w:val="left"/>
+            </w:pPr>
+            <w:r>
+              <w:t xml:space="preserve">Apresenta o que achou</w:t>
+            </w:r>
+            <w:r>
+              <w:t xml:space="preserve"> </w:t>
+            </w:r>
+            <w:r>
+              <w:rPr>
+                <w:bCs/>
+                <w:b/>
+              </w:rPr>
+              <w:t xml:space="preserve">antes</w:t>
+            </w:r>
+            <w:r>
+              <w:t xml:space="preserve"> </w:t>
+            </w:r>
+            <w:r>
+              <w:t xml:space="preserve">de fechar conclusão. Eles confirmam, corrigem o que você leu errado, e a ordem é definida junto</w:t>
+            </w:r>
+          </w:p>
+        </w:tc>
+        <w:tc>
+          <w:tcPr/>
+          <w:p>
+            <w:pPr>
+              <w:pStyle w:val="Compact"/>
+              <w:jc w:val="left"/>
+            </w:pPr>
+            <w:r>
+              <w:t xml:space="preserve">Você, ele e quem mais decidir</w:t>
+            </w:r>
+          </w:p>
+        </w:tc>
+        <w:tc>
+          <w:tcPr/>
+          <w:p>
+            <w:pPr>
+              <w:pStyle w:val="Compact"/>
+              <w:jc w:val="left"/>
+            </w:pPr>
+            <w:r>
+              <w:t xml:space="preserve">Matriz de Priorização e Fila de Casos de Uso, validadas</w:t>
+            </w:r>
+          </w:p>
+        </w:tc>
+      </w:tr>
+      <w:tr>
+        <w:tc>
+          <w:tcPr/>
+          <w:p>
+            <w:pPr>
+              <w:pStyle w:val="Compact"/>
+              <w:jc w:val="left"/>
+            </w:pPr>
+            <w:r>
+              <w:rPr>
+                <w:bCs/>
+                <w:b/>
+              </w:rPr>
+              <w:t xml:space="preserve">F5</w:t>
+            </w:r>
+            <w:r>
+              <w:t xml:space="preserve"> </w:t>
+            </w:r>
+            <w:r>
+              <w:t xml:space="preserve">Entrega</w:t>
+            </w:r>
+          </w:p>
+        </w:tc>
+        <w:tc>
+          <w:tcPr/>
+          <w:p>
+            <w:pPr>
+              <w:pStyle w:val="Compact"/>
+              <w:jc w:val="left"/>
+            </w:pPr>
+            <w:r>
+              <w:t xml:space="preserve">Semana 6</w:t>
+            </w:r>
+          </w:p>
+        </w:tc>
+        <w:tc>
+          <w:tcPr/>
+          <w:p>
+            <w:pPr>
+              <w:pStyle w:val="Compact"/>
+              <w:jc w:val="left"/>
+            </w:pPr>
+            <w:r>
+              <w:t xml:space="preserve">Apresentação executiva dos seis entregáveis, ao vivo.</w:t>
+            </w:r>
+            <w:r>
+              <w:t xml:space="preserve"> </w:t>
+            </w:r>
+            <w:r>
+              <w:rPr>
+                <w:bCs/>
+                <w:b/>
+              </w:rPr>
+              <w:t xml:space="preserve">Nada chega por e-mail sem você explicar</w:t>
+            </w:r>
+          </w:p>
+        </w:tc>
+        <w:tc>
+          <w:tcPr/>
+          <w:p>
+            <w:pPr>
+              <w:pStyle w:val="Compact"/>
+              <w:jc w:val="left"/>
+            </w:pPr>
+            <w:r>
+              <w:t xml:space="preserve">Você, ele e quem ele convidar</w:t>
+            </w:r>
+          </w:p>
+        </w:tc>
+        <w:tc>
+          <w:tcPr/>
+          <w:p>
+            <w:pPr>
+              <w:pStyle w:val="Compact"/>
+              <w:jc w:val="left"/>
+            </w:pPr>
+            <w:r>
+              <w:t xml:space="preserve">Os seis entregáveis, digitais e de propriedade dele</w:t>
+            </w:r>
+          </w:p>
+        </w:tc>
+      </w:tr>
+      <w:tr>
+        <w:tc>
+          <w:tcPr/>
+          <w:p>
+            <w:pPr>
+              <w:pStyle w:val="Compact"/>
+              <w:jc w:val="left"/>
+            </w:pPr>
+            <w:r>
+              <w:rPr>
+                <w:bCs/>
+                <w:b/>
+              </w:rPr>
+              <w:t xml:space="preserve">F6</w:t>
+            </w:r>
+            <w:r>
+              <w:t xml:space="preserve"> </w:t>
+            </w:r>
+            <w:r>
+              <w:t xml:space="preserve">Acompanhamento</w:t>
+            </w:r>
+          </w:p>
+        </w:tc>
+        <w:tc>
+          <w:tcPr/>
+          <w:p>
+            <w:pPr>
+              <w:pStyle w:val="Compact"/>
+              <w:jc w:val="left"/>
+            </w:pPr>
+            <w:r>
+              <w:t xml:space="preserve">90 dias após</w:t>
+            </w:r>
+          </w:p>
+        </w:tc>
+        <w:tc>
+          <w:tcPr/>
+          <w:p>
+            <w:pPr>
+              <w:pStyle w:val="Compact"/>
+              <w:jc w:val="left"/>
+            </w:pPr>
+            <w:r>
+              <w:t xml:space="preserve">Disponível para dúvida sobre o material, seja quem for executar. Se contratarem outro, você explica o diagnóstico para ele</w:t>
+            </w:r>
+          </w:p>
+        </w:tc>
+        <w:tc>
+          <w:tcPr/>
+          <w:p>
+            <w:pPr>
+              <w:pStyle w:val="Compact"/>
+              <w:jc w:val="left"/>
+            </w:pPr>
+            <w:r>
+              <w:t xml:space="preserve">Eles e quem estiver executando</w:t>
+            </w:r>
+          </w:p>
+        </w:tc>
+        <w:tc>
+          <w:tcPr/>
+          <w:p>
+            <w:pPr>
+              <w:pStyle w:val="Compact"/>
+              <w:jc w:val="left"/>
+            </w:pPr>
+            <w:r>
+              <w:t xml:space="preserve">Diagnóstico que continua útil depois de entregue</w:t>
+            </w:r>
+          </w:p>
+        </w:tc>
+      </w:tr>
+      <w:tr>
+        <w:tc>
+          <w:tcPr/>
+          <w:p>
+            <w:pPr>
+              <w:pStyle w:val="Compact"/>
+              <w:jc w:val="left"/>
+            </w:pPr>
+            <w:r>
+              <w:rPr>
+                <w:bCs/>
+                <w:b/>
+              </w:rPr>
+              <w:t xml:space="preserve">F7</w:t>
+            </w:r>
+            <w:r>
+              <w:t xml:space="preserve"> </w:t>
+            </w:r>
+            <w:r>
+              <w:t xml:space="preserve">Relação contínua</w:t>
+            </w:r>
+          </w:p>
+        </w:tc>
+        <w:tc>
+          <w:tcPr/>
+          <w:p>
+            <w:pPr>
+              <w:pStyle w:val="Compact"/>
+              <w:jc w:val="left"/>
+            </w:pPr>
+            <w:r>
+              <w:t xml:space="preserve">Sem data final</w:t>
+            </w:r>
+          </w:p>
+        </w:tc>
+        <w:tc>
+          <w:tcPr/>
+          <w:p>
+            <w:pPr>
+              <w:pStyle w:val="Compact"/>
+              <w:jc w:val="left"/>
+            </w:pPr>
+            <w:r>
+              <w:t xml:space="preserve">Eles passam a ter alguém que conhece a operação por dentro</w:t>
+            </w:r>
+          </w:p>
+        </w:tc>
+        <w:tc>
+          <w:tcPr/>
+          <w:p>
+            <w:pPr>
+              <w:pStyle w:val="Compact"/>
+              <w:jc w:val="left"/>
+            </w:pPr>
+            <w:r>
+              <w:t xml:space="preserve">Eles e você</w:t>
+            </w:r>
+          </w:p>
+        </w:tc>
+        <w:tc>
+          <w:tcPr/>
+          <w:p>
+            <w:pPr>
+              <w:pStyle w:val="Compact"/>
+              <w:jc w:val="left"/>
+            </w:pPr>
+            <w:r>
+              <w:t xml:space="preserve">Acesso direto quando precisarem, sem mensalidade correndo</w:t>
+            </w:r>
+          </w:p>
+        </w:tc>
+      </w:tr>
+    </w:tbl>
+    <w:p>
+      <w:pPr>
+        <w:pStyle w:val="BodyText"/>
+      </w:pPr>
+      <w:r>
+        <w:rPr>
+          <w:bCs/>
+          <w:b/>
+        </w:rPr>
+        <w:t xml:space="preserve">Por que esse nível de detalhe importa nesta venda:</w:t>
+      </w:r>
+      <w:r>
+        <w:t xml:space="preserve"> </w:t>
+      </w:r>
+      <w:r>
+        <w:t xml:space="preserve">ele vai pagar R$ 30 mil por um trabalho que ainda não existe. Cada linha acima é uma pergunta que ele faria e que você já respondeu.</w:t>
+      </w:r>
+      <w:r>
+        <w:t xml:space="preserve"> </w:t>
+      </w:r>
+      <w:r>
+        <w:rPr>
+          <w:bCs/>
+          <w:b/>
+        </w:rPr>
+        <w:t xml:space="preserve">Fase sem</w:t>
+      </w:r>
+      <w:r>
+        <w:rPr>
+          <w:bCs/>
+          <w:b/>
+        </w:rPr>
+        <w:t xml:space="preserve"> </w:t>
+      </w:r>
+      <w:r>
+        <w:rPr>
+          <w:bCs/>
+          <w:b/>
         </w:rPr>
         <w:t xml:space="preserve">“</w:t>
       </w:r>
       <w:r>
         <w:rPr>
-          <w:iCs/>
-          <w:i/>
-        </w:rPr>
-        <w:t xml:space="preserve">O prazo depende do escopo. Ele vai na proposta, em dias úteis, e entra no contrato</w:t>
-      </w:r>
-      <w:r>
-        <w:rPr>
-          <w:iCs/>
-          <w:i/>
+          <w:bCs/>
+          <w:b/>
+        </w:rPr>
+        <w:t xml:space="preserve">quem participa</w:t>
+      </w:r>
+      <w:r>
+        <w:rPr>
+          <w:bCs/>
+          <w:b/>
         </w:rPr>
         <w:t xml:space="preserve">”</w:t>
       </w:r>
-    </w:p>
-    <w:p>
-      <w:pPr>
-        <w:numPr>
-          <w:ilvl w:val="0"/>
-          <w:numId w:val="1004"/>
-        </w:numPr>
-        <w:pStyle w:val="Compact"/>
-      </w:pPr>
-      <w:r>
-        <w:t xml:space="preserve">❌ Valor por hora. Nem de exemplo</w:t>
-      </w:r>
-    </w:p>
-    <w:p>
-      <w:pPr>
-        <w:numPr>
-          <w:ilvl w:val="0"/>
-          <w:numId w:val="1004"/>
-        </w:numPr>
-        <w:pStyle w:val="Compact"/>
-      </w:pPr>
-      <w:r>
-        <w:t xml:space="preserve">❌ R$ 2.997. É a exceção do QG OS, não é âncora</w:t>
-      </w:r>
-    </w:p>
-    <w:p>
-      <w:pPr>
-        <w:numPr>
-          <w:ilvl w:val="0"/>
-          <w:numId w:val="1004"/>
-        </w:numPr>
-        <w:pStyle w:val="Compact"/>
-      </w:pPr>
-      <w:r>
-        <w:t xml:space="preserve">❌ Case Adash. Nunca foi entregue</w:t>
-      </w:r>
-    </w:p>
-    <w:p>
-      <w:pPr>
-        <w:numPr>
-          <w:ilvl w:val="0"/>
-          <w:numId w:val="1004"/>
-        </w:numPr>
-        <w:pStyle w:val="Compact"/>
-      </w:pPr>
-      <w:r>
-        <w:t xml:space="preserve">❌ Segunda call antes de fechar. Se precisou de duas conversas, a triagem falhou</w:t>
-      </w:r>
-    </w:p>
-    <w:p>
-      <w:pPr>
-        <w:numPr>
-          <w:ilvl w:val="0"/>
-          <w:numId w:val="1004"/>
-        </w:numPr>
-        <w:pStyle w:val="Compact"/>
-      </w:pPr>
-      <w:r>
-        <w:t xml:space="preserve">❌ Afirmar hipótese de gargalo como se fosse fato do Rocha. São pauta de pergunta</w:t>
+      <w:r>
+        <w:rPr>
+          <w:bCs/>
+          <w:b/>
+        </w:rPr>
+        <w:t xml:space="preserve"> </w:t>
+      </w:r>
+      <w:r>
+        <w:rPr>
+          <w:bCs/>
+          <w:b/>
+        </w:rPr>
+        <w:t xml:space="preserve">e sem</w:t>
+      </w:r>
+      <w:r>
+        <w:rPr>
+          <w:bCs/>
+          <w:b/>
+        </w:rPr>
+        <w:t xml:space="preserve"> </w:t>
+      </w:r>
+      <w:r>
+        <w:rPr>
+          <w:bCs/>
+          <w:b/>
+        </w:rPr>
+        <w:t xml:space="preserve">“</w:t>
+      </w:r>
+      <w:r>
+        <w:rPr>
+          <w:bCs/>
+          <w:b/>
+        </w:rPr>
+        <w:t xml:space="preserve">o que sai daqui</w:t>
+      </w:r>
+      <w:r>
+        <w:rPr>
+          <w:bCs/>
+          <w:b/>
+        </w:rPr>
+        <w:t xml:space="preserve">”</w:t>
+      </w:r>
+      <w:r>
+        <w:rPr>
+          <w:bCs/>
+          <w:b/>
+        </w:rPr>
+        <w:t xml:space="preserve"> </w:t>
+      </w:r>
+      <w:r>
+        <w:rPr>
+          <w:bCs/>
+          <w:b/>
+        </w:rPr>
+        <w:t xml:space="preserve">é promessa; com as duas, é plano.</w:t>
+      </w:r>
+    </w:p>
+    <w:p>
+      <w:pPr>
+        <w:pStyle w:val="BlockText"/>
+      </w:pPr>
+      <w:r>
+        <w:t xml:space="preserve">⚠️</w:t>
+      </w:r>
+      <w:r>
+        <w:t xml:space="preserve"> </w:t>
+      </w:r>
+      <w:r>
+        <w:rPr>
+          <w:bCs/>
+          <w:b/>
+        </w:rPr>
+        <w:t xml:space="preserve">F4 e F5 foram reescritas.</w:t>
+      </w:r>
+      <w:r>
+        <w:t xml:space="preserve"> </w:t>
+      </w:r>
+      <w:r>
+        <w:t xml:space="preserve">No método original elas eram</w:t>
+      </w:r>
+      <w:r>
+        <w:t xml:space="preserve"> </w:t>
+      </w:r>
+      <w:r>
+        <w:t xml:space="preserve">“</w:t>
+      </w:r>
+      <w:r>
+        <w:t xml:space="preserve">Homologação</w:t>
+      </w:r>
+      <w:r>
+        <w:t xml:space="preserve">”</w:t>
+      </w:r>
+      <w:r>
+        <w:t xml:space="preserve"> </w:t>
+      </w:r>
+      <w:r>
+        <w:t xml:space="preserve">e</w:t>
+      </w:r>
+      <w:r>
+        <w:t xml:space="preserve"> </w:t>
+      </w:r>
+      <w:r>
+        <w:t xml:space="preserve">“</w:t>
+      </w:r>
+      <w:r>
+        <w:t xml:space="preserve">Virada e transferência</w:t>
+      </w:r>
+      <w:r>
+        <w:t xml:space="preserve">”</w:t>
+      </w:r>
+      <w:r>
+        <w:t xml:space="preserve">, que só fazem sentido em projeto de construção. Em diagnóstico viram</w:t>
+      </w:r>
+      <w:r>
+        <w:t xml:space="preserve"> </w:t>
+      </w:r>
+      <w:r>
+        <w:rPr>
+          <w:bCs/>
+          <w:b/>
+        </w:rPr>
+        <w:t xml:space="preserve">priorização conjunta</w:t>
+      </w:r>
+      <w:r>
+        <w:t xml:space="preserve"> </w:t>
+      </w:r>
+      <w:r>
+        <w:t xml:space="preserve">e entrega da fila ranqueada.</w:t>
+      </w:r>
+    </w:p>
+    <w:bookmarkEnd w:id="52"/>
+    <w:bookmarkStart w:id="53" w:name="Xa3e4fb075460602bd1e114aae7e7b96c0659442"/>
+    <w:p>
+      <w:pPr>
+        <w:pStyle w:val="Heading3"/>
+      </w:pPr>
+      <w:r>
+        <w:t xml:space="preserve">A priorização é o produto, não um anexo dele</w:t>
+      </w:r>
+    </w:p>
+    <w:p>
+      <w:pPr>
+        <w:pStyle w:val="FirstParagraph"/>
+      </w:pPr>
+      <w:r>
+        <w:t xml:space="preserve">Achar problema numa operação de oito unidades é fácil: qualquer um lista vinte.</w:t>
+      </w:r>
+      <w:r>
+        <w:t xml:space="preserve"> </w:t>
+      </w:r>
+      <w:r>
+        <w:rPr>
+          <w:bCs/>
+          <w:b/>
+        </w:rPr>
+        <w:t xml:space="preserve">O que decide o resultado é a ordem</w:t>
+      </w:r>
+      <w:r>
+        <w:t xml:space="preserve">, e é aí que o diagnóstico se paga.</w:t>
+      </w:r>
+    </w:p>
+    <w:p>
+      <w:pPr>
+        <w:pStyle w:val="BodyText"/>
+      </w:pPr>
+      <w:r>
+        <w:t xml:space="preserve">Cada caso de uso é ranqueado por cinco critérios:</w:t>
+      </w:r>
+    </w:p>
+    <w:tbl>
+      <w:tblPr>
+        <w:tblStyle w:val="Table"/>
+        <w:tblW w:type="pct" w:w="5000"/>
+        <w:tblLook w:firstRow="1" w:lastRow="0" w:firstColumn="0" w:lastColumn="0" w:noHBand="0" w:noVBand="0" w:val="0020"/>
+        <w:jc w:val="start"/>
+      </w:tblPr>
+      <w:tblGrid>
+        <w:gridCol w:w="3960"/>
+        <w:gridCol w:w="3960"/>
+      </w:tblGrid>
+      <w:tr>
+        <w:trPr>
+          <w:tblHeader w:val="true"/>
+        </w:trPr>
+        <w:tc>
+          <w:tcPr/>
+          <w:p>
+            <w:pPr>
+              <w:pStyle w:val="Compact"/>
+              <w:jc w:val="left"/>
+            </w:pPr>
+            <w:r>
+              <w:t xml:space="preserve">#</w:t>
+            </w:r>
+          </w:p>
+        </w:tc>
+        <w:tc>
+          <w:tcPr/>
+          <w:p>
+            <w:pPr>
+              <w:pStyle w:val="Compact"/>
+              <w:jc w:val="left"/>
+            </w:pPr>
+            <w:r>
+              <w:t xml:space="preserve">Critério</w:t>
+            </w:r>
+          </w:p>
+        </w:tc>
+      </w:tr>
+      <w:tr>
+        <w:tc>
+          <w:tcPr/>
+          <w:p>
+            <w:pPr>
+              <w:pStyle w:val="Compact"/>
+              <w:jc w:val="left"/>
+            </w:pPr>
+            <w:r>
+              <w:t xml:space="preserve">1</w:t>
+            </w:r>
+          </w:p>
+        </w:tc>
+        <w:tc>
+          <w:tcPr/>
+          <w:p>
+            <w:pPr>
+              <w:pStyle w:val="Compact"/>
+              <w:jc w:val="left"/>
+            </w:pPr>
+            <w:r>
+              <w:t xml:space="preserve">Quanto devolve, em dinheiro ou hora de gente, por mês</w:t>
+            </w:r>
+          </w:p>
+        </w:tc>
+      </w:tr>
+      <w:tr>
+        <w:tc>
+          <w:tcPr/>
+          <w:p>
+            <w:pPr>
+              <w:pStyle w:val="Compact"/>
+              <w:jc w:val="left"/>
+            </w:pPr>
+            <w:r>
+              <w:t xml:space="preserve">2</w:t>
+            </w:r>
+          </w:p>
+        </w:tc>
+        <w:tc>
+          <w:tcPr/>
+          <w:p>
+            <w:pPr>
+              <w:pStyle w:val="Compact"/>
+              <w:jc w:val="left"/>
+            </w:pPr>
+            <w:r>
+              <w:t xml:space="preserve">Quanto tempo até rodar de verdade, não até ficar pronto</w:t>
+            </w:r>
+          </w:p>
+        </w:tc>
+      </w:tr>
+      <w:tr>
+        <w:tc>
+          <w:tcPr/>
+          <w:p>
+            <w:pPr>
+              <w:pStyle w:val="Compact"/>
+              <w:jc w:val="left"/>
+            </w:pPr>
+            <w:r>
+              <w:t xml:space="preserve">3</w:t>
+            </w:r>
+          </w:p>
+        </w:tc>
+        <w:tc>
+          <w:tcPr/>
+          <w:p>
+            <w:pPr>
+              <w:pStyle w:val="Compact"/>
+              <w:jc w:val="left"/>
+            </w:pPr>
+            <w:r>
+              <w:t xml:space="preserve">De quem depende. O que precisa da TOTVS entra em outra fila</w:t>
+            </w:r>
+          </w:p>
+        </w:tc>
+      </w:tr>
+      <w:tr>
+        <w:tc>
+          <w:tcPr/>
+          <w:p>
+            <w:pPr>
+              <w:pStyle w:val="Compact"/>
+              <w:jc w:val="left"/>
+            </w:pPr>
+            <w:r>
+              <w:t xml:space="preserve">4</w:t>
+            </w:r>
+          </w:p>
+        </w:tc>
+        <w:tc>
+          <w:tcPr/>
+          <w:p>
+            <w:pPr>
+              <w:pStyle w:val="Compact"/>
+              <w:jc w:val="left"/>
+            </w:pPr>
+            <w:r>
+              <w:t xml:space="preserve">O que trava se der errado. Nada que possa parar o balcão entra primeiro</w:t>
+            </w:r>
+          </w:p>
+        </w:tc>
+      </w:tr>
+      <w:tr>
+        <w:tc>
+          <w:tcPr/>
+          <w:p>
+            <w:pPr>
+              <w:pStyle w:val="Compact"/>
+              <w:jc w:val="left"/>
+            </w:pPr>
+            <w:r>
+              <w:t xml:space="preserve">5</w:t>
+            </w:r>
+          </w:p>
+        </w:tc>
+        <w:tc>
+          <w:tcPr/>
+          <w:p>
+            <w:pPr>
+              <w:pStyle w:val="Compact"/>
+              <w:jc w:val="left"/>
+            </w:pPr>
+            <w:r>
+              <w:t xml:space="preserve">O que ele destrava depois. Alguns casos só existem se outro vier antes</w:t>
+            </w:r>
+          </w:p>
+        </w:tc>
+      </w:tr>
+    </w:tbl>
+    <w:p>
+      <w:pPr>
+        <w:pStyle w:val="BodyText"/>
+      </w:pPr>
+      <w:r>
+        <w:t xml:space="preserve">O resultado vai numa matriz de</w:t>
+      </w:r>
+      <w:r>
+        <w:t xml:space="preserve"> </w:t>
+      </w:r>
+      <w:r>
+        <w:rPr>
+          <w:bCs/>
+          <w:b/>
+        </w:rPr>
+        <w:t xml:space="preserve">impacto no caixa × esforço até rodar</w:t>
+      </w:r>
+      <w:r>
+        <w:t xml:space="preserve">, com quatro destinos: começa aqui, entra no plano, se sobrar fôlego, e</w:t>
+      </w:r>
+      <w:r>
+        <w:t xml:space="preserve"> </w:t>
+      </w:r>
+      <w:r>
+        <w:rPr>
+          <w:bCs/>
+          <w:b/>
+        </w:rPr>
+        <w:t xml:space="preserve">não faz</w:t>
+      </w:r>
+      <w:r>
+        <w:t xml:space="preserve">.</w:t>
+      </w:r>
+    </w:p>
+    <w:p>
+      <w:pPr>
+        <w:pStyle w:val="BodyText"/>
+      </w:pPr>
+      <w:r>
+        <w:rPr>
+          <w:bCs/>
+          <w:b/>
+        </w:rPr>
+        <w:t xml:space="preserve">O quadrante</w:t>
+      </w:r>
+      <w:r>
+        <w:rPr>
+          <w:bCs/>
+          <w:b/>
+        </w:rPr>
+        <w:t xml:space="preserve"> </w:t>
+      </w:r>
+      <w:r>
+        <w:rPr>
+          <w:bCs/>
+          <w:b/>
+        </w:rPr>
+        <w:t xml:space="preserve">“</w:t>
+      </w:r>
+      <w:r>
+        <w:rPr>
+          <w:bCs/>
+          <w:b/>
+        </w:rPr>
+        <w:t xml:space="preserve">não faz</w:t>
+      </w:r>
+      <w:r>
+        <w:rPr>
+          <w:bCs/>
+          <w:b/>
+        </w:rPr>
+        <w:t xml:space="preserve">”</w:t>
+      </w:r>
+      <w:r>
+        <w:rPr>
+          <w:bCs/>
+          <w:b/>
+        </w:rPr>
+        <w:t xml:space="preserve"> </w:t>
+      </w:r>
+      <w:r>
+        <w:rPr>
+          <w:bCs/>
+          <w:b/>
+        </w:rPr>
+        <w:t xml:space="preserve">é o que dá credibilidade ao resto.</w:t>
+      </w:r>
+      <w:r>
+        <w:t xml:space="preserve"> </w:t>
+      </w:r>
+      <w:r>
+        <w:t xml:space="preserve">Consultor que aprova tudo está vendendo o próximo projeto. Dizer o que não vale a pena é o que separa diagnóstico de proposta comercial disfarçada, e vale dizer isso em voz alta na reunião.</w:t>
+      </w:r>
+      <w:r>
+        <w:t xml:space="preserve"> </w:t>
+      </w:r>
+      <w:r>
+        <w:t xml:space="preserve">&gt;</w:t>
+      </w:r>
+      <w:r>
+        <w:t xml:space="preserve"> </w:t>
+      </w:r>
+      <w:r>
+        <w:t xml:space="preserve">&gt; ⚠️</w:t>
+      </w:r>
+      <w:r>
+        <w:t xml:space="preserve"> </w:t>
+      </w:r>
+      <w:r>
+        <w:rPr>
+          <w:bCs/>
+          <w:b/>
+        </w:rPr>
+        <w:t xml:space="preserve">F7 não é despedida.</w:t>
+      </w:r>
+      <w:r>
+        <w:t xml:space="preserve"> </w:t>
+      </w:r>
+      <w:r>
+        <w:t xml:space="preserve">A redação anterior (</w:t>
+      </w:r>
+      <w:r>
+        <w:t xml:space="preserve">“</w:t>
+      </w:r>
+      <w:r>
+        <w:t xml:space="preserve">encerramento e carteira</w:t>
+      </w:r>
+      <w:r>
+        <w:t xml:space="preserve">”</w:t>
+      </w:r>
+      <w:r>
+        <w:t xml:space="preserve">) soava como agradecimento de saída. Decisão do dono: acompanhamento contínuo.</w:t>
+      </w:r>
+    </w:p>
+    <w:bookmarkEnd w:id="53"/>
+    <w:bookmarkStart w:id="54" w:name="X39a4e930fc5b77d6ceaaa33e923b4a4c5756728"/>
+    <w:p>
+      <w:pPr>
+        <w:pStyle w:val="Heading3"/>
+      </w:pPr>
+      <w:r>
+        <w:t xml:space="preserve">🔴 O bloqueio que precisa ser resolvido antes de segunda</w:t>
+      </w:r>
+    </w:p>
+    <w:p>
+      <w:pPr>
+        <w:pStyle w:val="FirstParagraph"/>
+      </w:pPr>
+      <w:r>
+        <w:t xml:space="preserve">O fechamento se dá</w:t>
+      </w:r>
+      <w:r>
+        <w:t xml:space="preserve"> </w:t>
+      </w:r>
+      <w:r>
+        <w:rPr>
+          <w:bCs/>
+          <w:b/>
+        </w:rPr>
+        <w:t xml:space="preserve">pelo pagamento</w:t>
+      </w:r>
+      <w:r>
+        <w:t xml:space="preserve">, não pela assinatura de contrato.</w:t>
+      </w:r>
+    </w:p>
+    <w:p>
+      <w:pPr>
+        <w:pStyle w:val="BodyText"/>
+      </w:pPr>
+      <w:r>
+        <w:t xml:space="preserve">Só que o Rocha é empresa de porte com contabilidade estruturada.</w:t>
+      </w:r>
+      <w:r>
+        <w:t xml:space="preserve"> </w:t>
+      </w:r>
+      <w:r>
+        <w:rPr>
+          <w:bCs/>
+          <w:b/>
+        </w:rPr>
+        <w:t xml:space="preserve">O financeiro deles vai pedir nota fiscal</w:t>
+      </w:r>
+      <w:r>
+        <w:t xml:space="preserve"> </w:t>
+      </w:r>
+      <w:r>
+        <w:t xml:space="preserve">para liberar o valor e para lançar a despesa. Sem CNPJ não há emissão, e sem emissão o pagamento pode não sair de lá mesmo com o Roberto querendo fechar.</w:t>
+      </w:r>
+    </w:p>
+    <w:p>
+      <w:pPr>
+        <w:pStyle w:val="BodyText"/>
+      </w:pPr>
+      <w:r>
+        <w:rPr>
+          <w:bCs/>
+          <w:b/>
+        </w:rPr>
+        <w:t xml:space="preserve">Isso não é risco jurídico distante, é risco de o dinheiro não entrar.</w:t>
+      </w:r>
+      <w:r>
+        <w:t xml:space="preserve"> </w:t>
+      </w:r>
+      <w:r>
+        <w:t xml:space="preserve">Precisa de resposta antes das 15h: como a nota vai ser emitida. Vale levar a pergunta para a reunião com o JDP às 11h.</w:t>
       </w:r>
     </w:p>
     <w:p>
@@ -3417,115 +6430,63 @@
         </w:pict>
       </w:r>
     </w:p>
-    <w:bookmarkEnd w:id="47"/>
-    <w:bookmarkStart w:id="48" w:name="Xc5ab924dd547f36c9df39c479f19360f6219f2b"/>
+    <w:bookmarkEnd w:id="54"/>
+    <w:bookmarkEnd w:id="55"/>
+    <w:bookmarkStart w:id="56" w:name="o-que-não-entra-em-nenhuma-hipótese"/>
     <w:p>
       <w:pPr>
         <w:pStyle w:val="Heading2"/>
       </w:pPr>
       <w:r>
-        <w:t xml:space="preserve">Cola de bolso — os 7 blocos em uma linha cada</w:t>
-      </w:r>
-    </w:p>
-    <w:p>
-      <w:pPr>
-        <w:pStyle w:val="SourceCode"/>
-      </w:pPr>
-      <w:r>
-        <w:rPr>
-          <w:rStyle w:val="VerbatimChar"/>
-        </w:rPr>
-        <w:t xml:space="preserve">1 · 0-4    Contrato da hora. Espera o "fechado"</w:t>
-      </w:r>
-      <w:r>
-        <w:br/>
-      </w:r>
-      <w:r>
-        <w:rPr>
-          <w:rStyle w:val="VerbatimChar"/>
-        </w:rPr>
-        <w:t xml:space="preserve">2 · 4-11   Só BUDGET falta. Confirma os outros 3 e não repergunta</w:t>
-      </w:r>
-      <w:r>
-        <w:br/>
-      </w:r>
-      <w:r>
-        <w:rPr>
-          <w:rStyle w:val="VerbatimChar"/>
-        </w:rPr>
-        <w:t xml:space="preserve">3 · 11-14  Quem eu sou. TETO DE 3 MIN. Odery se pedir, nunca Adash</w:t>
-      </w:r>
-      <w:r>
-        <w:br/>
-      </w:r>
-      <w:r>
-        <w:rPr>
-          <w:rStyle w:val="VerbatimChar"/>
-        </w:rPr>
-        <w:t xml:space="preserve">4 · 14-34  TOTVS parado → 20 pessoas → "quanto custa um atendente?"</w:t>
-      </w:r>
-      <w:r>
-        <w:br/>
-      </w:r>
-      <w:r>
-        <w:rPr>
-          <w:rStyle w:val="VerbatimChar"/>
-        </w:rPr>
-        <w:t xml:space="preserve">           ELE diz o número. Você não estima.</w:t>
-      </w:r>
-      <w:r>
-        <w:br/>
-      </w:r>
-      <w:r>
-        <w:rPr>
-          <w:rStyle w:val="VerbatimChar"/>
-        </w:rPr>
-        <w:t xml:space="preserve">5 · 34-46  "Não falta sistema, faltam 20 pessoas que o mercado não vende"</w:t>
-      </w:r>
-      <w:r>
-        <w:br/>
-      </w:r>
-      <w:r>
-        <w:rPr>
-          <w:rStyle w:val="VerbatimChar"/>
-        </w:rPr>
-        <w:t xml:space="preserve">           Não ataca a TOTVS. A pergunta aberta é o que ele compra.</w:t>
-      </w:r>
-      <w:r>
-        <w:br/>
-      </w:r>
-      <w:r>
-        <w:rPr>
-          <w:rStyle w:val="VerbatimChar"/>
-        </w:rPr>
-        <w:t xml:space="preserve">6 · 46-52  Valor da consultoria + prazo. Só isso. DEPOIS CALA A BOCA</w:t>
-      </w:r>
-      <w:r>
-        <w:br/>
-      </w:r>
-      <w:r>
-        <w:rPr>
-          <w:rStyle w:val="VerbatimChar"/>
-        </w:rPr>
-        <w:t xml:space="preserve">7 · 52-60  "Faz sentido?" → data e hora pra resposta</w:t>
-      </w:r>
-    </w:p>
-    <w:p>
-      <w:pPr>
-        <w:pStyle w:val="FirstParagraph"/>
-      </w:pPr>
-      <w:r>
-        <w:rPr>
-          <w:bCs/>
-          <w:b/>
-        </w:rPr>
-        <w:t xml:space="preserve">A frase que carrega a reunião:</w:t>
-      </w:r>
-      <w:r>
-        <w:t xml:space="preserve"> </w:t>
-      </w:r>
-      <w:r>
-        <w:t xml:space="preserve">&gt;</w:t>
+        <w:t xml:space="preserve">O que não entra, em nenhuma hipótese</w:t>
+      </w:r>
+    </w:p>
+    <w:p>
+      <w:pPr>
+        <w:numPr>
+          <w:ilvl w:val="0"/>
+          <w:numId w:val="1005"/>
+        </w:numPr>
+        <w:pStyle w:val="Compact"/>
+      </w:pPr>
+      <w:r>
+        <w:t xml:space="preserve">❌ Número fechado de implementação. Você não diagnosticou nada ainda</w:t>
+      </w:r>
+    </w:p>
+    <w:p>
+      <w:pPr>
+        <w:numPr>
+          <w:ilvl w:val="0"/>
+          <w:numId w:val="1005"/>
+        </w:numPr>
+        <w:pStyle w:val="Compact"/>
+      </w:pPr>
+      <w:r>
+        <w:t xml:space="preserve">❌ Deck compartilhado na tela. Nunca foi auditado depois do pivot</w:t>
+      </w:r>
+    </w:p>
+    <w:p>
+      <w:pPr>
+        <w:numPr>
+          <w:ilvl w:val="0"/>
+          <w:numId w:val="1005"/>
+        </w:numPr>
+        <w:pStyle w:val="Compact"/>
+      </w:pPr>
+      <w:r>
+        <w:t xml:space="preserve">❌ Site, landing page, identidade visual. Fora de escopo desde 04/ago</w:t>
+      </w:r>
+    </w:p>
+    <w:p>
+      <w:pPr>
+        <w:numPr>
+          <w:ilvl w:val="0"/>
+          <w:numId w:val="1005"/>
+        </w:numPr>
+        <w:pStyle w:val="Compact"/>
+      </w:pPr>
+      <w:r>
+        <w:t xml:space="preserve">❌ Prazo de construção. Não existe padrão.</w:t>
       </w:r>
       <w:r>
         <w:t xml:space="preserve"> </w:t>
@@ -3535,11 +6496,213 @@
           <w:iCs/>
           <w:i/>
         </w:rPr>
+        <w:t xml:space="preserve">“</w:t>
+      </w:r>
+      <w:r>
+        <w:rPr>
+          <w:iCs/>
+          <w:i/>
+        </w:rPr>
+        <w:t xml:space="preserve">O prazo depende do escopo. Ele vai na proposta, em dias úteis, e entra no contrato</w:t>
+      </w:r>
+      <w:r>
+        <w:rPr>
+          <w:iCs/>
+          <w:i/>
+        </w:rPr>
+        <w:t xml:space="preserve">”</w:t>
+      </w:r>
+    </w:p>
+    <w:p>
+      <w:pPr>
+        <w:numPr>
+          <w:ilvl w:val="0"/>
+          <w:numId w:val="1005"/>
+        </w:numPr>
+        <w:pStyle w:val="Compact"/>
+      </w:pPr>
+      <w:r>
+        <w:t xml:space="preserve">❌ Valor por hora. Nem de exemplo</w:t>
+      </w:r>
+    </w:p>
+    <w:p>
+      <w:pPr>
+        <w:numPr>
+          <w:ilvl w:val="0"/>
+          <w:numId w:val="1005"/>
+        </w:numPr>
+        <w:pStyle w:val="Compact"/>
+      </w:pPr>
+      <w:r>
+        <w:t xml:space="preserve">❌ R$ 2.997. É a exceção do QG OS, não é âncora</w:t>
+      </w:r>
+    </w:p>
+    <w:p>
+      <w:pPr>
+        <w:numPr>
+          <w:ilvl w:val="0"/>
+          <w:numId w:val="1005"/>
+        </w:numPr>
+        <w:pStyle w:val="Compact"/>
+      </w:pPr>
+      <w:r>
+        <w:t xml:space="preserve">❌ Case Adash. Nunca foi entregue</w:t>
+      </w:r>
+    </w:p>
+    <w:p>
+      <w:pPr>
+        <w:numPr>
+          <w:ilvl w:val="0"/>
+          <w:numId w:val="1005"/>
+        </w:numPr>
+        <w:pStyle w:val="Compact"/>
+      </w:pPr>
+      <w:r>
+        <w:t xml:space="preserve">❌ Segunda call antes de fechar. Se precisou de duas conversas, a triagem falhou</w:t>
+      </w:r>
+    </w:p>
+    <w:p>
+      <w:pPr>
+        <w:numPr>
+          <w:ilvl w:val="0"/>
+          <w:numId w:val="1005"/>
+        </w:numPr>
+        <w:pStyle w:val="Compact"/>
+      </w:pPr>
+      <w:r>
+        <w:t xml:space="preserve">❌ Afirmar hipótese de gargalo como se fosse fato do Rocha. São pauta de pergunta</w:t>
+      </w:r>
+    </w:p>
+    <w:p>
+      <w:r>
+        <w:pict>
+          <v:rect style="width:0;height:1.5pt" o:hralign="center" o:hrstd="t" o:hr="t"/>
+        </w:pict>
+      </w:r>
+    </w:p>
+    <w:bookmarkEnd w:id="56"/>
+    <w:bookmarkStart w:id="57" w:name="Xc5ab924dd547f36c9df39c479f19360f6219f2b"/>
+    <w:p>
+      <w:pPr>
+        <w:pStyle w:val="Heading2"/>
+      </w:pPr>
+      <w:r>
+        <w:t xml:space="preserve">Cola de bolso — os 7 blocos em uma linha cada</w:t>
+      </w:r>
+    </w:p>
+    <w:p>
+      <w:pPr>
+        <w:pStyle w:val="SourceCode"/>
+      </w:pPr>
+      <w:r>
+        <w:rPr>
+          <w:rStyle w:val="VerbatimChar"/>
+        </w:rPr>
+        <w:t xml:space="preserve">1 · 0-4    Contrato da hora. Espera o "fechado"</w:t>
+      </w:r>
+      <w:r>
+        <w:br/>
+      </w:r>
+      <w:r>
+        <w:rPr>
+          <w:rStyle w:val="VerbatimChar"/>
+        </w:rPr>
+        <w:t xml:space="preserve">2 · 4-11   Só BUDGET falta. Confirma os outros 3 e não repergunta</w:t>
+      </w:r>
+      <w:r>
+        <w:br/>
+      </w:r>
+      <w:r>
+        <w:rPr>
+          <w:rStyle w:val="VerbatimChar"/>
+        </w:rPr>
+        <w:t xml:space="preserve">3 · 11-14  Quem eu sou. TETO DE 3 MIN. Odery se pedir, nunca Adash</w:t>
+      </w:r>
+      <w:r>
+        <w:br/>
+      </w:r>
+      <w:r>
+        <w:rPr>
+          <w:rStyle w:val="VerbatimChar"/>
+        </w:rPr>
+        <w:t xml:space="preserve">4 · 14-34  TOTVS parado → 20 pessoas → "quanto custa um atendente?"</w:t>
+      </w:r>
+      <w:r>
+        <w:br/>
+      </w:r>
+      <w:r>
+        <w:rPr>
+          <w:rStyle w:val="VerbatimChar"/>
+        </w:rPr>
+        <w:t xml:space="preserve">           ELE diz o número. Você não estima.</w:t>
+      </w:r>
+      <w:r>
+        <w:br/>
+      </w:r>
+      <w:r>
+        <w:rPr>
+          <w:rStyle w:val="VerbatimChar"/>
+        </w:rPr>
+        <w:t xml:space="preserve">5 · 34-46  "Não falta sistema, faltam 20 pessoas que o mercado não vende"</w:t>
+      </w:r>
+      <w:r>
+        <w:br/>
+      </w:r>
+      <w:r>
+        <w:rPr>
+          <w:rStyle w:val="VerbatimChar"/>
+        </w:rPr>
+        <w:t xml:space="preserve">           Não ataca a TOTVS. A pergunta aberta é o que ele compra.</w:t>
+      </w:r>
+      <w:r>
+        <w:br/>
+      </w:r>
+      <w:r>
+        <w:rPr>
+          <w:rStyle w:val="VerbatimChar"/>
+        </w:rPr>
+        <w:t xml:space="preserve">6 · 46-52  Valor da consultoria + prazo. Só isso. DEPOIS CALA A BOCA</w:t>
+      </w:r>
+      <w:r>
+        <w:br/>
+      </w:r>
+      <w:r>
+        <w:rPr>
+          <w:rStyle w:val="VerbatimChar"/>
+        </w:rPr>
+        <w:t xml:space="preserve">7 · 52-60  "Faz sentido?" → data e hora pra resposta</w:t>
+      </w:r>
+    </w:p>
+    <w:p>
+      <w:pPr>
+        <w:pStyle w:val="FirstParagraph"/>
+      </w:pPr>
+      <w:r>
+        <w:rPr>
+          <w:bCs/>
+          <w:b/>
+        </w:rPr>
+        <w:t xml:space="preserve">A frase que carrega a reunião:</w:t>
+      </w:r>
+      <w:r>
+        <w:t xml:space="preserve"> </w:t>
+      </w:r>
+      <w:r>
+        <w:t xml:space="preserve">&gt;</w:t>
+      </w:r>
+      <w:r>
+        <w:t xml:space="preserve"> </w:t>
+      </w:r>
+      <w:r>
+        <w:rPr>
+          <w:iCs/>
+          <w:i/>
+        </w:rPr>
         <w:t xml:space="preserve">Vocês não têm problema de sistema. Falta gente que o mercado não vende, e a ferramenta que vocês compraram pra resolver isso está parada pelo mesmo motivo.</w:t>
       </w:r>
     </w:p>
-    <w:bookmarkEnd w:id="48"/>
-    <w:bookmarkEnd w:id="49"/>
+    <w:bookmarkEnd w:id="57"/>
+    <w:bookmarkEnd w:id="58"/>
     <w:sectPr/>
   </w:body>
 </w:document>
@@ -3847,6 +7010,36 @@
     <w:abstractNumId w:val="991"/>
   </w:num>
   <w:num w:numId="1004">
+    <w:abstractNumId w:val="99411"/>
+    <w:lvlOverride w:ilvl="0">
+      <w:startOverride w:val="1"/>
+    </w:lvlOverride>
+    <w:lvlOverride w:ilvl="1">
+      <w:startOverride w:val="1"/>
+    </w:lvlOverride>
+    <w:lvlOverride w:ilvl="2">
+      <w:startOverride w:val="1"/>
+    </w:lvlOverride>
+    <w:lvlOverride w:ilvl="3">
+      <w:startOverride w:val="1"/>
+    </w:lvlOverride>
+    <w:lvlOverride w:ilvl="4">
+      <w:startOverride w:val="1"/>
+    </w:lvlOverride>
+    <w:lvlOverride w:ilvl="5">
+      <w:startOverride w:val="1"/>
+    </w:lvlOverride>
+    <w:lvlOverride w:ilvl="6">
+      <w:startOverride w:val="1"/>
+    </w:lvlOverride>
+    <w:lvlOverride w:ilvl="7">
+      <w:startOverride w:val="1"/>
+    </w:lvlOverride>
+    <w:lvlOverride w:ilvl="8">
+      <w:startOverride w:val="1"/>
+    </w:lvlOverride>
+  </w:num>
+  <w:num w:numId="1005">
     <w:abstractNumId w:val="991"/>
   </w:num>
 </w:numbering>

</xml_diff>